<commit_message>
added logic to replace empty choice e with none of the above
</commit_message>
<xml_diff>
--- a/tests_output/PROVA_APJ-C.docx
+++ b/tests_output/PROVA_APJ-C.docx
@@ -4370,107 +4370,107 @@
           <w:szCs w:val="22"/>
           <w:u w:val="none"/>
         </w:rPr>
-        <w:t xml:space="preserve">1. [A questão não possui enunciado]</w:t>
-      </w:r>
-    </w:p>
-    <w:p>
-      <w:pPr>
-        <w:pStyle w:val="normal11"/>
-        <w:spacing w:lineRule="auto" w:line="240"/>
-        <w:jc w:val="both"/>
-        <w:rPr>
-          <w:u w:val="none"/>
-        </w:rPr>
-      </w:pPr>
-      <w:r>
-        <w:rPr>
-          <w:b w:val="false"/>
-          <w:bCs w:val="false"/>
-          <w:sz w:val="22"/>
-          <w:szCs w:val="22"/>
-          <w:u w:val="none"/>
-        </w:rPr>
-        <w:t xml:space="preserve">A) [Opção indisponível]</w:t>
-      </w:r>
-    </w:p>
-    <w:p>
-      <w:pPr>
-        <w:pStyle w:val="normal11"/>
-        <w:spacing w:lineRule="auto" w:line="240"/>
-        <w:jc w:val="both"/>
-        <w:rPr>
-          <w:u w:val="none"/>
-        </w:rPr>
-      </w:pPr>
-      <w:r>
-        <w:rPr>
-          <w:b w:val="false"/>
-          <w:bCs w:val="false"/>
-          <w:sz w:val="22"/>
-          <w:szCs w:val="22"/>
-          <w:u w:val="none"/>
-        </w:rPr>
-        <w:t xml:space="preserve">B) [Opção indisponível]</w:t>
-      </w:r>
-    </w:p>
-    <w:p>
-      <w:pPr>
-        <w:pStyle w:val="normal11"/>
-        <w:spacing w:lineRule="auto" w:line="240"/>
-        <w:jc w:val="both"/>
-        <w:rPr>
-          <w:u w:val="none"/>
-        </w:rPr>
-      </w:pPr>
-      <w:r>
-        <w:rPr>
-          <w:b w:val="false"/>
-          <w:bCs w:val="false"/>
-          <w:sz w:val="22"/>
-          <w:szCs w:val="22"/>
-          <w:u w:val="none"/>
-        </w:rPr>
-        <w:t xml:space="preserve">C) [Opção indisponível]</w:t>
-      </w:r>
-    </w:p>
-    <w:p>
-      <w:pPr>
-        <w:pStyle w:val="normal11"/>
-        <w:spacing w:lineRule="auto" w:line="240"/>
-        <w:jc w:val="both"/>
-        <w:rPr>
-          <w:u w:val="none"/>
-        </w:rPr>
-      </w:pPr>
-      <w:r>
-        <w:rPr>
-          <w:b w:val="false"/>
-          <w:bCs w:val="false"/>
-          <w:sz w:val="22"/>
-          <w:szCs w:val="22"/>
-          <w:u w:val="none"/>
-        </w:rPr>
-        <w:t xml:space="preserve">D) [Opção indisponível]</w:t>
-      </w:r>
-    </w:p>
-    <w:p>
-      <w:pPr>
-        <w:pStyle w:val="normal11"/>
-        <w:spacing w:lineRule="auto" w:line="240"/>
-        <w:jc w:val="both"/>
-        <w:rPr>
-          <w:u w:val="none"/>
-        </w:rPr>
-      </w:pPr>
-      <w:r>
-        <w:rPr>
-          <w:b w:val="false"/>
-          <w:bCs w:val="false"/>
-          <w:sz w:val="22"/>
-          <w:szCs w:val="22"/>
-          <w:u w:val="none"/>
-        </w:rPr>
-        <w:t xml:space="preserve">E) [Opção indisponível]</w:t>
+        <w:t xml:space="preserve">1. Ao elaborar um relatório, o policial deve descrever os acontecimentos sem inserir preferências, sentimentos ou julgamentos pessoais. Qual princípio da redação oficial está diretamente relacionado a essa exigência?</w:t>
+      </w:r>
+    </w:p>
+    <w:p>
+      <w:pPr>
+        <w:pStyle w:val="normal11"/>
+        <w:spacing w:lineRule="auto" w:line="240"/>
+        <w:jc w:val="both"/>
+        <w:rPr>
+          <w:u w:val="none"/>
+        </w:rPr>
+      </w:pPr>
+      <w:r>
+        <w:rPr>
+          <w:b w:val="false"/>
+          <w:bCs w:val="false"/>
+          <w:sz w:val="22"/>
+          <w:szCs w:val="22"/>
+          <w:u w:val="none"/>
+        </w:rPr>
+        <w:t xml:space="preserve">A) Publicidade.</w:t>
+      </w:r>
+    </w:p>
+    <w:p>
+      <w:pPr>
+        <w:pStyle w:val="normal11"/>
+        <w:spacing w:lineRule="auto" w:line="240"/>
+        <w:jc w:val="both"/>
+        <w:rPr>
+          <w:u w:val="none"/>
+        </w:rPr>
+      </w:pPr>
+      <w:r>
+        <w:rPr>
+          <w:b w:val="false"/>
+          <w:bCs w:val="false"/>
+          <w:sz w:val="22"/>
+          <w:szCs w:val="22"/>
+          <w:u w:val="none"/>
+        </w:rPr>
+        <w:t xml:space="preserve">B) Formalidade.</w:t>
+      </w:r>
+    </w:p>
+    <w:p>
+      <w:pPr>
+        <w:pStyle w:val="normal11"/>
+        <w:spacing w:lineRule="auto" w:line="240"/>
+        <w:jc w:val="both"/>
+        <w:rPr>
+          <w:u w:val="none"/>
+        </w:rPr>
+      </w:pPr>
+      <w:r>
+        <w:rPr>
+          <w:b w:val="false"/>
+          <w:bCs w:val="false"/>
+          <w:sz w:val="22"/>
+          <w:szCs w:val="22"/>
+          <w:u w:val="none"/>
+        </w:rPr>
+        <w:t xml:space="preserve">C) Impessoalidade.</w:t>
+      </w:r>
+    </w:p>
+    <w:p>
+      <w:pPr>
+        <w:pStyle w:val="normal11"/>
+        <w:spacing w:lineRule="auto" w:line="240"/>
+        <w:jc w:val="both"/>
+        <w:rPr>
+          <w:u w:val="none"/>
+        </w:rPr>
+      </w:pPr>
+      <w:r>
+        <w:rPr>
+          <w:b w:val="false"/>
+          <w:bCs w:val="false"/>
+          <w:sz w:val="22"/>
+          <w:szCs w:val="22"/>
+          <w:u w:val="none"/>
+        </w:rPr>
+        <w:t xml:space="preserve">D) Hierarquia.</w:t>
+      </w:r>
+    </w:p>
+    <w:p>
+      <w:pPr>
+        <w:pStyle w:val="normal11"/>
+        <w:spacing w:lineRule="auto" w:line="240"/>
+        <w:jc w:val="both"/>
+        <w:rPr>
+          <w:u w:val="none"/>
+        </w:rPr>
+      </w:pPr>
+      <w:r>
+        <w:rPr>
+          <w:b w:val="false"/>
+          <w:bCs w:val="false"/>
+          <w:sz w:val="22"/>
+          <w:szCs w:val="22"/>
+          <w:u w:val="none"/>
+        </w:rPr>
+        <w:t xml:space="preserve">E) Oralidade.</w:t>
       </w:r>
     </w:p>
     <w:p>
@@ -4511,107 +4511,107 @@
           <w:szCs w:val="22"/>
           <w:u w:val="none"/>
         </w:rPr>
-        <w:t xml:space="preserve">2. [A questão não possui enunciado]</w:t>
-      </w:r>
-    </w:p>
-    <w:p>
-      <w:pPr>
-        <w:pStyle w:val="normal11"/>
-        <w:spacing w:lineRule="auto" w:line="240"/>
-        <w:jc w:val="both"/>
-        <w:rPr>
-          <w:u w:val="none"/>
-        </w:rPr>
-      </w:pPr>
-      <w:r>
-        <w:rPr>
-          <w:b w:val="false"/>
-          <w:bCs w:val="false"/>
-          <w:sz w:val="22"/>
-          <w:szCs w:val="22"/>
-          <w:u w:val="none"/>
-        </w:rPr>
-        <w:t xml:space="preserve">A) [Opção indisponível]</w:t>
-      </w:r>
-    </w:p>
-    <w:p>
-      <w:pPr>
-        <w:pStyle w:val="normal11"/>
-        <w:spacing w:lineRule="auto" w:line="240"/>
-        <w:jc w:val="both"/>
-        <w:rPr>
-          <w:u w:val="none"/>
-        </w:rPr>
-      </w:pPr>
-      <w:r>
-        <w:rPr>
-          <w:b w:val="false"/>
-          <w:bCs w:val="false"/>
-          <w:sz w:val="22"/>
-          <w:szCs w:val="22"/>
-          <w:u w:val="none"/>
-        </w:rPr>
-        <w:t xml:space="preserve">B) [Opção indisponível]</w:t>
-      </w:r>
-    </w:p>
-    <w:p>
-      <w:pPr>
-        <w:pStyle w:val="normal11"/>
-        <w:spacing w:lineRule="auto" w:line="240"/>
-        <w:jc w:val="both"/>
-        <w:rPr>
-          <w:u w:val="none"/>
-        </w:rPr>
-      </w:pPr>
-      <w:r>
-        <w:rPr>
-          <w:b w:val="false"/>
-          <w:bCs w:val="false"/>
-          <w:sz w:val="22"/>
-          <w:szCs w:val="22"/>
-          <w:u w:val="none"/>
-        </w:rPr>
-        <w:t xml:space="preserve">C) [Opção indisponível]</w:t>
-      </w:r>
-    </w:p>
-    <w:p>
-      <w:pPr>
-        <w:pStyle w:val="normal11"/>
-        <w:spacing w:lineRule="auto" w:line="240"/>
-        <w:jc w:val="both"/>
-        <w:rPr>
-          <w:u w:val="none"/>
-        </w:rPr>
-      </w:pPr>
-      <w:r>
-        <w:rPr>
-          <w:b w:val="false"/>
-          <w:bCs w:val="false"/>
-          <w:sz w:val="22"/>
-          <w:szCs w:val="22"/>
-          <w:u w:val="none"/>
-        </w:rPr>
-        <w:t xml:space="preserve">D) [Opção indisponível]</w:t>
-      </w:r>
-    </w:p>
-    <w:p>
-      <w:pPr>
-        <w:pStyle w:val="normal11"/>
-        <w:spacing w:lineRule="auto" w:line="240"/>
-        <w:jc w:val="both"/>
-        <w:rPr>
-          <w:u w:val="none"/>
-        </w:rPr>
-      </w:pPr>
-      <w:r>
-        <w:rPr>
-          <w:b w:val="false"/>
-          <w:bCs w:val="false"/>
-          <w:sz w:val="22"/>
-          <w:szCs w:val="22"/>
-          <w:u w:val="none"/>
-        </w:rPr>
-        <w:t xml:space="preserve">E) [Opção indisponível]</w:t>
+        <w:t xml:space="preserve">2. A diligência policial acontece no ambiente real, mas seus resultados precisam ser formalizados para integrar o procedimento investigativo. Nesse contexto, qual é a principal função da escrita policial?</w:t>
+      </w:r>
+    </w:p>
+    <w:p>
+      <w:pPr>
+        <w:pStyle w:val="normal11"/>
+        <w:spacing w:lineRule="auto" w:line="240"/>
+        <w:jc w:val="both"/>
+        <w:rPr>
+          <w:u w:val="none"/>
+        </w:rPr>
+      </w:pPr>
+      <w:r>
+        <w:rPr>
+          <w:b w:val="false"/>
+          <w:bCs w:val="false"/>
+          <w:sz w:val="22"/>
+          <w:szCs w:val="22"/>
+          <w:u w:val="none"/>
+        </w:rPr>
+        <w:t xml:space="preserve">A) Substituir as diligências realizadas pelos policiais.</w:t>
+      </w:r>
+    </w:p>
+    <w:p>
+      <w:pPr>
+        <w:pStyle w:val="normal11"/>
+        <w:spacing w:lineRule="auto" w:line="240"/>
+        <w:jc w:val="both"/>
+        <w:rPr>
+          <w:u w:val="none"/>
+        </w:rPr>
+      </w:pPr>
+      <w:r>
+        <w:rPr>
+          <w:b w:val="false"/>
+          <w:bCs w:val="false"/>
+          <w:sz w:val="22"/>
+          <w:szCs w:val="22"/>
+          <w:u w:val="none"/>
+        </w:rPr>
+        <w:t xml:space="preserve">B) Registrar livremente as impressões pessoais da equipe.</w:t>
+      </w:r>
+    </w:p>
+    <w:p>
+      <w:pPr>
+        <w:pStyle w:val="normal11"/>
+        <w:spacing w:lineRule="auto" w:line="240"/>
+        <w:jc w:val="both"/>
+        <w:rPr>
+          <w:u w:val="none"/>
+        </w:rPr>
+      </w:pPr>
+      <w:r>
+        <w:rPr>
+          <w:b w:val="false"/>
+          <w:bCs w:val="false"/>
+          <w:sz w:val="22"/>
+          <w:szCs w:val="22"/>
+          <w:u w:val="none"/>
+        </w:rPr>
+        <w:t xml:space="preserve">C) Introduzir no procedimento, com clareza e fidelidade, os fatos apurados na investigação.</w:t>
+      </w:r>
+    </w:p>
+    <w:p>
+      <w:pPr>
+        <w:pStyle w:val="normal11"/>
+        <w:spacing w:lineRule="auto" w:line="240"/>
+        <w:jc w:val="both"/>
+        <w:rPr>
+          <w:u w:val="none"/>
+        </w:rPr>
+      </w:pPr>
+      <w:r>
+        <w:rPr>
+          <w:b w:val="false"/>
+          <w:bCs w:val="false"/>
+          <w:sz w:val="22"/>
+          <w:szCs w:val="22"/>
+          <w:u w:val="none"/>
+        </w:rPr>
+        <w:t xml:space="preserve">D) Dispensar a análise posterior da Autoridade Policial.</w:t>
+      </w:r>
+    </w:p>
+    <w:p>
+      <w:pPr>
+        <w:pStyle w:val="normal11"/>
+        <w:spacing w:lineRule="auto" w:line="240"/>
+        <w:jc w:val="both"/>
+        <w:rPr>
+          <w:u w:val="none"/>
+        </w:rPr>
+      </w:pPr>
+      <w:r>
+        <w:rPr>
+          <w:b w:val="false"/>
+          <w:bCs w:val="false"/>
+          <w:sz w:val="22"/>
+          <w:szCs w:val="22"/>
+          <w:u w:val="none"/>
+        </w:rPr>
+        <w:t xml:space="preserve">E) Transformar automaticamente os elementos informativos em prova judicial.</w:t>
       </w:r>
     </w:p>
     <w:p>
@@ -4652,107 +4652,107 @@
           <w:szCs w:val="22"/>
           <w:u w:val="none"/>
         </w:rPr>
-        <w:t xml:space="preserve">3. [A questão não possui enunciado]</w:t>
-      </w:r>
-    </w:p>
-    <w:p>
-      <w:pPr>
-        <w:pStyle w:val="normal11"/>
-        <w:spacing w:lineRule="auto" w:line="240"/>
-        <w:jc w:val="both"/>
-        <w:rPr>
-          <w:u w:val="none"/>
-        </w:rPr>
-      </w:pPr>
-      <w:r>
-        <w:rPr>
-          <w:b w:val="false"/>
-          <w:bCs w:val="false"/>
-          <w:sz w:val="22"/>
-          <w:szCs w:val="22"/>
-          <w:u w:val="none"/>
-        </w:rPr>
-        <w:t xml:space="preserve">A) [Opção indisponível]</w:t>
-      </w:r>
-    </w:p>
-    <w:p>
-      <w:pPr>
-        <w:pStyle w:val="normal11"/>
-        <w:spacing w:lineRule="auto" w:line="240"/>
-        <w:jc w:val="both"/>
-        <w:rPr>
-          <w:u w:val="none"/>
-        </w:rPr>
-      </w:pPr>
-      <w:r>
-        <w:rPr>
-          <w:b w:val="false"/>
-          <w:bCs w:val="false"/>
-          <w:sz w:val="22"/>
-          <w:szCs w:val="22"/>
-          <w:u w:val="none"/>
-        </w:rPr>
-        <w:t xml:space="preserve">B) [Opção indisponível]</w:t>
-      </w:r>
-    </w:p>
-    <w:p>
-      <w:pPr>
-        <w:pStyle w:val="normal11"/>
-        <w:spacing w:lineRule="auto" w:line="240"/>
-        <w:jc w:val="both"/>
-        <w:rPr>
-          <w:u w:val="none"/>
-        </w:rPr>
-      </w:pPr>
-      <w:r>
-        <w:rPr>
-          <w:b w:val="false"/>
-          <w:bCs w:val="false"/>
-          <w:sz w:val="22"/>
-          <w:szCs w:val="22"/>
-          <w:u w:val="none"/>
-        </w:rPr>
-        <w:t xml:space="preserve">C) [Opção indisponível]</w:t>
-      </w:r>
-    </w:p>
-    <w:p>
-      <w:pPr>
-        <w:pStyle w:val="normal11"/>
-        <w:spacing w:lineRule="auto" w:line="240"/>
-        <w:jc w:val="both"/>
-        <w:rPr>
-          <w:u w:val="none"/>
-        </w:rPr>
-      </w:pPr>
-      <w:r>
-        <w:rPr>
-          <w:b w:val="false"/>
-          <w:bCs w:val="false"/>
-          <w:sz w:val="22"/>
-          <w:szCs w:val="22"/>
-          <w:u w:val="none"/>
-        </w:rPr>
-        <w:t xml:space="preserve">D) [Opção indisponível]</w:t>
-      </w:r>
-    </w:p>
-    <w:p>
-      <w:pPr>
-        <w:pStyle w:val="normal11"/>
-        <w:spacing w:lineRule="auto" w:line="240"/>
-        <w:jc w:val="both"/>
-        <w:rPr>
-          <w:u w:val="none"/>
-        </w:rPr>
-      </w:pPr>
-      <w:r>
-        <w:rPr>
-          <w:b w:val="false"/>
-          <w:bCs w:val="false"/>
-          <w:sz w:val="22"/>
-          <w:szCs w:val="22"/>
-          <w:u w:val="none"/>
-        </w:rPr>
-        <w:t xml:space="preserve">E) [Opção indisponível]</w:t>
+        <w:t xml:space="preserve">3. O raciocínio técnico do relatório deve diferenciar a realidade constatada, o significado atribuído aos elementos encontrados e a síntese decorrente da análise. Qual sequência representa corretamente essa construção?</w:t>
+      </w:r>
+    </w:p>
+    <w:p>
+      <w:pPr>
+        <w:pStyle w:val="normal11"/>
+        <w:spacing w:lineRule="auto" w:line="240"/>
+        <w:jc w:val="both"/>
+        <w:rPr>
+          <w:u w:val="none"/>
+        </w:rPr>
+      </w:pPr>
+      <w:r>
+        <w:rPr>
+          <w:b w:val="false"/>
+          <w:bCs w:val="false"/>
+          <w:sz w:val="22"/>
+          <w:szCs w:val="22"/>
+          <w:u w:val="none"/>
+        </w:rPr>
+        <w:t xml:space="preserve">A) Interpretação, fato e decisão.</w:t>
+      </w:r>
+    </w:p>
+    <w:p>
+      <w:pPr>
+        <w:pStyle w:val="normal11"/>
+        <w:spacing w:lineRule="auto" w:line="240"/>
+        <w:jc w:val="both"/>
+        <w:rPr>
+          <w:u w:val="none"/>
+        </w:rPr>
+      </w:pPr>
+      <w:r>
+        <w:rPr>
+          <w:b w:val="false"/>
+          <w:bCs w:val="false"/>
+          <w:sz w:val="22"/>
+          <w:szCs w:val="22"/>
+          <w:u w:val="none"/>
+        </w:rPr>
+        <w:t xml:space="preserve">B) Fato, interpretação e conclusão.</w:t>
+      </w:r>
+    </w:p>
+    <w:p>
+      <w:pPr>
+        <w:pStyle w:val="normal11"/>
+        <w:spacing w:lineRule="auto" w:line="240"/>
+        <w:jc w:val="both"/>
+        <w:rPr>
+          <w:u w:val="none"/>
+        </w:rPr>
+      </w:pPr>
+      <w:r>
+        <w:rPr>
+          <w:b w:val="false"/>
+          <w:bCs w:val="false"/>
+          <w:sz w:val="22"/>
+          <w:szCs w:val="22"/>
+          <w:u w:val="none"/>
+        </w:rPr>
+        <w:t xml:space="preserve">C) Conclusão, interpretação e fato.</w:t>
+      </w:r>
+    </w:p>
+    <w:p>
+      <w:pPr>
+        <w:pStyle w:val="normal11"/>
+        <w:spacing w:lineRule="auto" w:line="240"/>
+        <w:jc w:val="both"/>
+        <w:rPr>
+          <w:u w:val="none"/>
+        </w:rPr>
+      </w:pPr>
+      <w:r>
+        <w:rPr>
+          <w:b w:val="false"/>
+          <w:bCs w:val="false"/>
+          <w:sz w:val="22"/>
+          <w:szCs w:val="22"/>
+          <w:u w:val="none"/>
+        </w:rPr>
+        <w:t xml:space="preserve">D) Fato, conclusão e interpretação.</w:t>
+      </w:r>
+    </w:p>
+    <w:p>
+      <w:pPr>
+        <w:pStyle w:val="normal11"/>
+        <w:spacing w:lineRule="auto" w:line="240"/>
+        <w:jc w:val="both"/>
+        <w:rPr>
+          <w:u w:val="none"/>
+        </w:rPr>
+      </w:pPr>
+      <w:r>
+        <w:rPr>
+          <w:b w:val="false"/>
+          <w:bCs w:val="false"/>
+          <w:sz w:val="22"/>
+          <w:szCs w:val="22"/>
+          <w:u w:val="none"/>
+        </w:rPr>
+        <w:t xml:space="preserve">E) Opinião, fato e conclusão.</w:t>
       </w:r>
     </w:p>
     <w:p>
@@ -7494,107 +7494,107 @@
           <w:szCs w:val="22"/>
           <w:u w:val="none"/>
         </w:rPr>
-        <w:t xml:space="preserve">21. [A questão não possui enunciado]</w:t>
-      </w:r>
-    </w:p>
-    <w:p>
-      <w:pPr>
-        <w:pStyle w:val="normal11"/>
-        <w:spacing w:lineRule="auto" w:line="240"/>
-        <w:jc w:val="both"/>
-        <w:rPr>
-          <w:u w:val="none"/>
-        </w:rPr>
-      </w:pPr>
-      <w:r>
-        <w:rPr>
-          <w:b w:val="false"/>
-          <w:bCs w:val="false"/>
-          <w:sz w:val="22"/>
-          <w:szCs w:val="22"/>
-          <w:u w:val="none"/>
-        </w:rPr>
-        <w:t xml:space="preserve">A) [Opção indisponível]</w:t>
-      </w:r>
-    </w:p>
-    <w:p>
-      <w:pPr>
-        <w:pStyle w:val="normal11"/>
-        <w:spacing w:lineRule="auto" w:line="240"/>
-        <w:jc w:val="both"/>
-        <w:rPr>
-          <w:u w:val="none"/>
-        </w:rPr>
-      </w:pPr>
-      <w:r>
-        <w:rPr>
-          <w:b w:val="false"/>
-          <w:bCs w:val="false"/>
-          <w:sz w:val="22"/>
-          <w:szCs w:val="22"/>
-          <w:u w:val="none"/>
-        </w:rPr>
-        <w:t xml:space="preserve">B) [Opção indisponível]</w:t>
-      </w:r>
-    </w:p>
-    <w:p>
-      <w:pPr>
-        <w:pStyle w:val="normal11"/>
-        <w:spacing w:lineRule="auto" w:line="240"/>
-        <w:jc w:val="both"/>
-        <w:rPr>
-          <w:u w:val="none"/>
-        </w:rPr>
-      </w:pPr>
-      <w:r>
-        <w:rPr>
-          <w:b w:val="false"/>
-          <w:bCs w:val="false"/>
-          <w:sz w:val="22"/>
-          <w:szCs w:val="22"/>
-          <w:u w:val="none"/>
-        </w:rPr>
-        <w:t xml:space="preserve">C) [Opção indisponível]</w:t>
-      </w:r>
-    </w:p>
-    <w:p>
-      <w:pPr>
-        <w:pStyle w:val="normal11"/>
-        <w:spacing w:lineRule="auto" w:line="240"/>
-        <w:jc w:val="both"/>
-        <w:rPr>
-          <w:u w:val="none"/>
-        </w:rPr>
-      </w:pPr>
-      <w:r>
-        <w:rPr>
-          <w:b w:val="false"/>
-          <w:bCs w:val="false"/>
-          <w:sz w:val="22"/>
-          <w:szCs w:val="22"/>
-          <w:u w:val="none"/>
-        </w:rPr>
-        <w:t xml:space="preserve">D) [Opção indisponível]</w:t>
-      </w:r>
-    </w:p>
-    <w:p>
-      <w:pPr>
-        <w:pStyle w:val="normal11"/>
-        <w:spacing w:lineRule="auto" w:line="240"/>
-        <w:jc w:val="both"/>
-        <w:rPr>
-          <w:u w:val="none"/>
-        </w:rPr>
-      </w:pPr>
-      <w:r>
-        <w:rPr>
-          <w:b w:val="false"/>
-          <w:bCs w:val="false"/>
-          <w:sz w:val="22"/>
-          <w:szCs w:val="22"/>
-          <w:u w:val="none"/>
-        </w:rPr>
-        <w:t xml:space="preserve">E) [Opção indisponível]</w:t>
+        <w:t xml:space="preserve">21. Com base no material fornecido no curso de formação e conforme abordado em sala de aula, no que concerne ao conceito e às características que definem a Investigação Policial, assinale a alternativa correta:</w:t>
+      </w:r>
+    </w:p>
+    <w:p>
+      <w:pPr>
+        <w:pStyle w:val="normal11"/>
+        <w:spacing w:lineRule="auto" w:line="240"/>
+        <w:jc w:val="both"/>
+        <w:rPr>
+          <w:u w:val="none"/>
+        </w:rPr>
+      </w:pPr>
+      <w:r>
+        <w:rPr>
+          <w:b w:val="false"/>
+          <w:bCs w:val="false"/>
+          <w:sz w:val="22"/>
+          <w:szCs w:val="22"/>
+          <w:u w:val="none"/>
+        </w:rPr>
+        <w:t xml:space="preserve">A) A investigação policial é caracterizada como uma atividade-meio da Polícia Judiciária, sendo padronizada e idêntica para todos os casos práticos, o que elimina qualquer margem de dinamismo na atuação do investigador.</w:t>
+      </w:r>
+    </w:p>
+    <w:p>
+      <w:pPr>
+        <w:pStyle w:val="normal11"/>
+        <w:spacing w:lineRule="auto" w:line="240"/>
+        <w:jc w:val="both"/>
+        <w:rPr>
+          <w:u w:val="none"/>
+        </w:rPr>
+      </w:pPr>
+      <w:r>
+        <w:rPr>
+          <w:b w:val="false"/>
+          <w:bCs w:val="false"/>
+          <w:sz w:val="22"/>
+          <w:szCs w:val="22"/>
+          <w:u w:val="none"/>
+        </w:rPr>
+        <w:t xml:space="preserve">B) A dimensão estratégica da investigação policial é representada pela sequência de processos lógico-dedutivos de ordem puramente científica executados pelo investigador, enquanto a característica intelectual se refere à análise de custo-benefício de cada diligência.</w:t>
+      </w:r>
+    </w:p>
+    <w:p>
+      <w:pPr>
+        <w:pStyle w:val="normal11"/>
+        <w:spacing w:lineRule="auto" w:line="240"/>
+        <w:jc w:val="both"/>
+        <w:rPr>
+          <w:u w:val="none"/>
+        </w:rPr>
+      </w:pPr>
+      <w:r>
+        <w:rPr>
+          <w:b w:val="false"/>
+          <w:bCs w:val="false"/>
+          <w:sz w:val="22"/>
+          <w:szCs w:val="22"/>
+          <w:u w:val="none"/>
+        </w:rPr>
+        <w:t xml:space="preserve">C) A investigação policial é uma atividade que possui natureza prática (ações e reações que decorrem de interações humanas), natureza intelectual (sequência de processos lógico-dedutivos) e natureza estratégica (análise do custo-benefício de cada diligência).</w:t>
+      </w:r>
+    </w:p>
+    <w:p>
+      <w:pPr>
+        <w:pStyle w:val="normal11"/>
+        <w:spacing w:lineRule="auto" w:line="240"/>
+        <w:jc w:val="both"/>
+        <w:rPr>
+          <w:u w:val="none"/>
+        </w:rPr>
+      </w:pPr>
+      <w:r>
+        <w:rPr>
+          <w:b w:val="false"/>
+          <w:bCs w:val="false"/>
+          <w:sz w:val="22"/>
+          <w:szCs w:val="22"/>
+          <w:u w:val="none"/>
+        </w:rPr>
+        <w:t xml:space="preserve">D) O objetivo imediato e finalístico da investigação de crimes patrimoniais é a prisão do agente, dispensando-se o planejamento prévio e a delimitação do nível de profundidade da investigação.</w:t>
+      </w:r>
+    </w:p>
+    <w:p>
+      <w:pPr>
+        <w:pStyle w:val="normal11"/>
+        <w:spacing w:lineRule="auto" w:line="240"/>
+        <w:jc w:val="both"/>
+        <w:rPr>
+          <w:u w:val="none"/>
+        </w:rPr>
+      </w:pPr>
+      <w:r>
+        <w:rPr>
+          <w:b w:val="false"/>
+          <w:bCs w:val="false"/>
+          <w:sz w:val="22"/>
+          <w:szCs w:val="22"/>
+          <w:u w:val="none"/>
+        </w:rPr>
+        <w:t xml:space="preserve">E) Por ser uma atividade dinâmica, as investigações policiais de crimes contra o patrimônio devem ser conduzidas sem roteiros básicos ou planejamento estratégico, sob pena de engessamento das diligências de campo.</w:t>
       </w:r>
     </w:p>
     <w:p>
@@ -7635,107 +7635,107 @@
           <w:szCs w:val="22"/>
           <w:u w:val="none"/>
         </w:rPr>
-        <w:t xml:space="preserve">22. [A questão não possui enunciado]</w:t>
-      </w:r>
-    </w:p>
-    <w:p>
-      <w:pPr>
-        <w:pStyle w:val="normal11"/>
-        <w:spacing w:lineRule="auto" w:line="240"/>
-        <w:jc w:val="both"/>
-        <w:rPr>
-          <w:u w:val="none"/>
-        </w:rPr>
-      </w:pPr>
-      <w:r>
-        <w:rPr>
-          <w:b w:val="false"/>
-          <w:bCs w:val="false"/>
-          <w:sz w:val="22"/>
-          <w:szCs w:val="22"/>
-          <w:u w:val="none"/>
-        </w:rPr>
-        <w:t xml:space="preserve">A) [Opção indisponível]</w:t>
-      </w:r>
-    </w:p>
-    <w:p>
-      <w:pPr>
-        <w:pStyle w:val="normal11"/>
-        <w:spacing w:lineRule="auto" w:line="240"/>
-        <w:jc w:val="both"/>
-        <w:rPr>
-          <w:u w:val="none"/>
-        </w:rPr>
-      </w:pPr>
-      <w:r>
-        <w:rPr>
-          <w:b w:val="false"/>
-          <w:bCs w:val="false"/>
-          <w:sz w:val="22"/>
-          <w:szCs w:val="22"/>
-          <w:u w:val="none"/>
-        </w:rPr>
-        <w:t xml:space="preserve">B) [Opção indisponível]</w:t>
-      </w:r>
-    </w:p>
-    <w:p>
-      <w:pPr>
-        <w:pStyle w:val="normal11"/>
-        <w:spacing w:lineRule="auto" w:line="240"/>
-        <w:jc w:val="both"/>
-        <w:rPr>
-          <w:u w:val="none"/>
-        </w:rPr>
-      </w:pPr>
-      <w:r>
-        <w:rPr>
-          <w:b w:val="false"/>
-          <w:bCs w:val="false"/>
-          <w:sz w:val="22"/>
-          <w:szCs w:val="22"/>
-          <w:u w:val="none"/>
-        </w:rPr>
-        <w:t xml:space="preserve">C) [Opção indisponível]</w:t>
-      </w:r>
-    </w:p>
-    <w:p>
-      <w:pPr>
-        <w:pStyle w:val="normal11"/>
-        <w:spacing w:lineRule="auto" w:line="240"/>
-        <w:jc w:val="both"/>
-        <w:rPr>
-          <w:u w:val="none"/>
-        </w:rPr>
-      </w:pPr>
-      <w:r>
-        <w:rPr>
-          <w:b w:val="false"/>
-          <w:bCs w:val="false"/>
-          <w:sz w:val="22"/>
-          <w:szCs w:val="22"/>
-          <w:u w:val="none"/>
-        </w:rPr>
-        <w:t xml:space="preserve">D) [Opção indisponível]</w:t>
-      </w:r>
-    </w:p>
-    <w:p>
-      <w:pPr>
-        <w:pStyle w:val="normal11"/>
-        <w:spacing w:lineRule="auto" w:line="240"/>
-        <w:jc w:val="both"/>
-        <w:rPr>
-          <w:u w:val="none"/>
-        </w:rPr>
-      </w:pPr>
-      <w:r>
-        <w:rPr>
-          <w:b w:val="false"/>
-          <w:bCs w:val="false"/>
-          <w:sz w:val="22"/>
-          <w:szCs w:val="22"/>
-          <w:u w:val="none"/>
-        </w:rPr>
-        <w:t xml:space="preserve">E) [Opção indisponível]</w:t>
+        <w:t xml:space="preserve">22. Com base no material fornecido no curso de formação e conforme abordado em sala de aula, em caso de eventual desconformidade ou violação da Cadeia de Custódia Digital (Art. 158-A do CPP), assinale a alternativa que descreve corretamente o entendimento aplicável aos efeitos práticos da prova no processo penal:</w:t>
+      </w:r>
+    </w:p>
+    <w:p>
+      <w:pPr>
+        <w:pStyle w:val="normal11"/>
+        <w:spacing w:lineRule="auto" w:line="240"/>
+        <w:jc w:val="both"/>
+        <w:rPr>
+          <w:u w:val="none"/>
+        </w:rPr>
+      </w:pPr>
+      <w:r>
+        <w:rPr>
+          <w:b w:val="false"/>
+          <w:bCs w:val="false"/>
+          <w:sz w:val="22"/>
+          <w:szCs w:val="22"/>
+          <w:u w:val="none"/>
+        </w:rPr>
+        <w:t xml:space="preserve">A) A violação da cadeia de custódia digital gera a nulidade absoluta e automática da prova e de todo o processo criminal, independentemente de demonstração de adulteração.</w:t>
+      </w:r>
+    </w:p>
+    <w:p>
+      <w:pPr>
+        <w:pStyle w:val="normal11"/>
+        <w:spacing w:lineRule="auto" w:line="240"/>
+        <w:jc w:val="both"/>
+        <w:rPr>
+          <w:u w:val="none"/>
+        </w:rPr>
+      </w:pPr>
+      <w:r>
+        <w:rPr>
+          <w:b w:val="false"/>
+          <w:bCs w:val="false"/>
+          <w:sz w:val="22"/>
+          <w:szCs w:val="22"/>
+          <w:u w:val="none"/>
+        </w:rPr>
+        <w:t xml:space="preserve">B) A desconformidade na cadeia de custódia repercute na confiabilidade da prova, não gerando nulidade automática; sua eficácia deve ser valorada pelo juiz, cabendo à defesa demonstrar eventuais adulterações ou causas de invalidação.</w:t>
+      </w:r>
+    </w:p>
+    <w:p>
+      <w:pPr>
+        <w:pStyle w:val="normal11"/>
+        <w:spacing w:lineRule="auto" w:line="240"/>
+        <w:jc w:val="both"/>
+        <w:rPr>
+          <w:u w:val="none"/>
+        </w:rPr>
+      </w:pPr>
+      <w:r>
+        <w:rPr>
+          <w:b w:val="false"/>
+          <w:bCs w:val="false"/>
+          <w:sz w:val="22"/>
+          <w:szCs w:val="22"/>
+          <w:u w:val="none"/>
+        </w:rPr>
+        <w:t xml:space="preserve">C) O ônus de provar a integridade absoluta da prova digital, após alegação genérica de quebra de custódia, é transferido de forma automática e exclusiva para a equipe de investigadores que realizou a apreensão.</w:t>
+      </w:r>
+    </w:p>
+    <w:p>
+      <w:pPr>
+        <w:pStyle w:val="normal11"/>
+        <w:spacing w:lineRule="auto" w:line="240"/>
+        <w:jc w:val="both"/>
+        <w:rPr>
+          <w:u w:val="none"/>
+        </w:rPr>
+      </w:pPr>
+      <w:r>
+        <w:rPr>
+          <w:b w:val="false"/>
+          <w:bCs w:val="false"/>
+          <w:sz w:val="22"/>
+          <w:szCs w:val="22"/>
+          <w:u w:val="none"/>
+        </w:rPr>
+        <w:t xml:space="preserve">D) A cadeia de custódia digital aplica-se unicamente a celulares apreendidos diretamente com o suspeito no momento do flagrante, não incidindo sobre aparelhos abandonados no local do crime ou localizados em estabelecimentos prisionais.</w:t>
+      </w:r>
+    </w:p>
+    <w:p>
+      <w:pPr>
+        <w:pStyle w:val="normal11"/>
+        <w:spacing w:lineRule="auto" w:line="240"/>
+        <w:jc w:val="both"/>
+        <w:rPr>
+          <w:u w:val="none"/>
+        </w:rPr>
+      </w:pPr>
+      <w:r>
+        <w:rPr>
+          <w:b w:val="false"/>
+          <w:bCs w:val="false"/>
+          <w:sz w:val="22"/>
+          <w:szCs w:val="22"/>
+          <w:u w:val="none"/>
+        </w:rPr>
+        <w:t xml:space="preserve">E) A violação da cadeia de custódia digital acarreta a imediata absolvição do investigado por falta de materialidade.</w:t>
       </w:r>
     </w:p>
     <w:p>
@@ -7776,107 +7776,107 @@
           <w:szCs w:val="22"/>
           <w:u w:val="none"/>
         </w:rPr>
-        <w:t xml:space="preserve">23. [A questão não possui enunciado]</w:t>
-      </w:r>
-    </w:p>
-    <w:p>
-      <w:pPr>
-        <w:pStyle w:val="normal11"/>
-        <w:spacing w:lineRule="auto" w:line="240"/>
-        <w:jc w:val="both"/>
-        <w:rPr>
-          <w:u w:val="none"/>
-        </w:rPr>
-      </w:pPr>
-      <w:r>
-        <w:rPr>
-          <w:b w:val="false"/>
-          <w:bCs w:val="false"/>
-          <w:sz w:val="22"/>
-          <w:szCs w:val="22"/>
-          <w:u w:val="none"/>
-        </w:rPr>
-        <w:t xml:space="preserve">A) [Opção indisponível]</w:t>
-      </w:r>
-    </w:p>
-    <w:p>
-      <w:pPr>
-        <w:pStyle w:val="normal11"/>
-        <w:spacing w:lineRule="auto" w:line="240"/>
-        <w:jc w:val="both"/>
-        <w:rPr>
-          <w:u w:val="none"/>
-        </w:rPr>
-      </w:pPr>
-      <w:r>
-        <w:rPr>
-          <w:b w:val="false"/>
-          <w:bCs w:val="false"/>
-          <w:sz w:val="22"/>
-          <w:szCs w:val="22"/>
-          <w:u w:val="none"/>
-        </w:rPr>
-        <w:t xml:space="preserve">B) [Opção indisponível]</w:t>
-      </w:r>
-    </w:p>
-    <w:p>
-      <w:pPr>
-        <w:pStyle w:val="normal11"/>
-        <w:spacing w:lineRule="auto" w:line="240"/>
-        <w:jc w:val="both"/>
-        <w:rPr>
-          <w:u w:val="none"/>
-        </w:rPr>
-      </w:pPr>
-      <w:r>
-        <w:rPr>
-          <w:b w:val="false"/>
-          <w:bCs w:val="false"/>
-          <w:sz w:val="22"/>
-          <w:szCs w:val="22"/>
-          <w:u w:val="none"/>
-        </w:rPr>
-        <w:t xml:space="preserve">C) [Opção indisponível]</w:t>
-      </w:r>
-    </w:p>
-    <w:p>
-      <w:pPr>
-        <w:pStyle w:val="normal11"/>
-        <w:spacing w:lineRule="auto" w:line="240"/>
-        <w:jc w:val="both"/>
-        <w:rPr>
-          <w:u w:val="none"/>
-        </w:rPr>
-      </w:pPr>
-      <w:r>
-        <w:rPr>
-          <w:b w:val="false"/>
-          <w:bCs w:val="false"/>
-          <w:sz w:val="22"/>
-          <w:szCs w:val="22"/>
-          <w:u w:val="none"/>
-        </w:rPr>
-        <w:t xml:space="preserve">D) [Opção indisponível]</w:t>
-      </w:r>
-    </w:p>
-    <w:p>
-      <w:pPr>
-        <w:pStyle w:val="normal11"/>
-        <w:spacing w:lineRule="auto" w:line="240"/>
-        <w:jc w:val="both"/>
-        <w:rPr>
-          <w:u w:val="none"/>
-        </w:rPr>
-      </w:pPr>
-      <w:r>
-        <w:rPr>
-          <w:b w:val="false"/>
-          <w:bCs w:val="false"/>
-          <w:sz w:val="22"/>
-          <w:szCs w:val="22"/>
-          <w:u w:val="none"/>
-        </w:rPr>
-        <w:t xml:space="preserve">E) [Opção indisponível]</w:t>
+        <w:t xml:space="preserve">23. Com base no material fornecido no curso de formação e conforme abordado em sala de aula, no âmbito da investigação de furtos a residências ou comércios, as qualificadoras de "rompimento de obstáculo" e "escalada" possuem conceitos jurídicos com efeitos práticos extremamente relevantes. Sobre a demonstração dessas qualificadoras, assinale a alternativa correta:</w:t>
+      </w:r>
+    </w:p>
+    <w:p>
+      <w:pPr>
+        <w:pStyle w:val="normal11"/>
+        <w:spacing w:lineRule="auto" w:line="240"/>
+        <w:jc w:val="both"/>
+        <w:rPr>
+          <w:u w:val="none"/>
+        </w:rPr>
+      </w:pPr>
+      <w:r>
+        <w:rPr>
+          <w:b w:val="false"/>
+          <w:bCs w:val="false"/>
+          <w:sz w:val="22"/>
+          <w:szCs w:val="22"/>
+          <w:u w:val="none"/>
+        </w:rPr>
+        <w:t xml:space="preserve">A) A presença dessas qualificadoras deve ser demonstrada exclusivamente por meio do laudo pericial de local de crime, sendo desnecessária ou irrelevante qualquer menção ou detalhamento fático nos relatórios de investigação policial.</w:t>
+      </w:r>
+    </w:p>
+    <w:p>
+      <w:pPr>
+        <w:pStyle w:val="normal11"/>
+        <w:spacing w:lineRule="auto" w:line="240"/>
+        <w:jc w:val="both"/>
+        <w:rPr>
+          <w:u w:val="none"/>
+        </w:rPr>
+      </w:pPr>
+      <w:r>
+        <w:rPr>
+          <w:b w:val="false"/>
+          <w:bCs w:val="false"/>
+          <w:sz w:val="22"/>
+          <w:szCs w:val="22"/>
+          <w:u w:val="none"/>
+        </w:rPr>
+        <w:t xml:space="preserve">B) O rompimento de obstáculo e a escalada são qualificadoras de natureza puramente formal, cuja caracterização prática exige apenas a declaração verbal da vítima na confecção do Boletim de Ocorrência.</w:t>
+      </w:r>
+    </w:p>
+    <w:p>
+      <w:pPr>
+        <w:pStyle w:val="normal11"/>
+        <w:spacing w:lineRule="auto" w:line="240"/>
+        <w:jc w:val="both"/>
+        <w:rPr>
+          <w:u w:val="none"/>
+        </w:rPr>
+      </w:pPr>
+      <w:r>
+        <w:rPr>
+          <w:b w:val="false"/>
+          <w:bCs w:val="false"/>
+          <w:sz w:val="22"/>
+          <w:szCs w:val="22"/>
+          <w:u w:val="none"/>
+        </w:rPr>
+        <w:t xml:space="preserve">C) Há a necessidade prática de demonstração fática dessas qualificadoras seja nos relatórios de investigação elaborados pela equipe policial, seja no laudo de local de crime produzido pela polícia científica.</w:t>
+      </w:r>
+    </w:p>
+    <w:p>
+      <w:pPr>
+        <w:pStyle w:val="normal11"/>
+        <w:spacing w:lineRule="auto" w:line="240"/>
+        <w:jc w:val="both"/>
+        <w:rPr>
+          <w:u w:val="none"/>
+        </w:rPr>
+      </w:pPr>
+      <w:r>
+        <w:rPr>
+          <w:b w:val="false"/>
+          <w:bCs w:val="false"/>
+          <w:sz w:val="22"/>
+          <w:szCs w:val="22"/>
+          <w:u w:val="none"/>
+        </w:rPr>
+        <w:t xml:space="preserve">D) A escalada, por se tratar de conceito puramente subjetivo, dispensa perícia técnica, devendo o investigador demonstrar sua ocorrência apenas por meio de depoimento de testemunhas presenciais.</w:t>
+      </w:r>
+    </w:p>
+    <w:p>
+      <w:pPr>
+        <w:pStyle w:val="normal11"/>
+        <w:spacing w:lineRule="auto" w:line="240"/>
+        <w:jc w:val="both"/>
+        <w:rPr>
+          <w:u w:val="none"/>
+        </w:rPr>
+      </w:pPr>
+      <w:r>
+        <w:rPr>
+          <w:b w:val="false"/>
+          <w:bCs w:val="false"/>
+          <w:sz w:val="22"/>
+          <w:szCs w:val="22"/>
+          <w:u w:val="none"/>
+        </w:rPr>
+        <w:t xml:space="preserve">E) Caso a equipe de investigação não consiga isolar o local de crime imediatamente após o furto, as qualificadoras de escalada e rompimento de obstáculo são desconsideradas juridicamente, restando apenas a apuração do furto simples.</w:t>
       </w:r>
     </w:p>
     <w:p>
@@ -11585,107 +11585,107 @@
           <w:szCs w:val="22"/>
           <w:u w:val="none"/>
         </w:rPr>
-        <w:t xml:space="preserve">47. [A questão não possui enunciado]</w:t>
-      </w:r>
-    </w:p>
-    <w:p>
-      <w:pPr>
-        <w:pStyle w:val="normal11"/>
-        <w:spacing w:lineRule="auto" w:line="240"/>
-        <w:jc w:val="both"/>
-        <w:rPr>
-          <w:u w:val="none"/>
-        </w:rPr>
-      </w:pPr>
-      <w:r>
-        <w:rPr>
-          <w:b w:val="false"/>
-          <w:bCs w:val="false"/>
-          <w:sz w:val="22"/>
-          <w:szCs w:val="22"/>
-          <w:u w:val="none"/>
-        </w:rPr>
-        <w:t xml:space="preserve">A) [Opção indisponível]</w:t>
-      </w:r>
-    </w:p>
-    <w:p>
-      <w:pPr>
-        <w:pStyle w:val="normal11"/>
-        <w:spacing w:lineRule="auto" w:line="240"/>
-        <w:jc w:val="both"/>
-        <w:rPr>
-          <w:u w:val="none"/>
-        </w:rPr>
-      </w:pPr>
-      <w:r>
-        <w:rPr>
-          <w:b w:val="false"/>
-          <w:bCs w:val="false"/>
-          <w:sz w:val="22"/>
-          <w:szCs w:val="22"/>
-          <w:u w:val="none"/>
-        </w:rPr>
-        <w:t xml:space="preserve">B) [Opção indisponível]</w:t>
-      </w:r>
-    </w:p>
-    <w:p>
-      <w:pPr>
-        <w:pStyle w:val="normal11"/>
-        <w:spacing w:lineRule="auto" w:line="240"/>
-        <w:jc w:val="both"/>
-        <w:rPr>
-          <w:u w:val="none"/>
-        </w:rPr>
-      </w:pPr>
-      <w:r>
-        <w:rPr>
-          <w:b w:val="false"/>
-          <w:bCs w:val="false"/>
-          <w:sz w:val="22"/>
-          <w:szCs w:val="22"/>
-          <w:u w:val="none"/>
-        </w:rPr>
-        <w:t xml:space="preserve">C) [Opção indisponível]</w:t>
-      </w:r>
-    </w:p>
-    <w:p>
-      <w:pPr>
-        <w:pStyle w:val="normal11"/>
-        <w:spacing w:lineRule="auto" w:line="240"/>
-        <w:jc w:val="both"/>
-        <w:rPr>
-          <w:u w:val="none"/>
-        </w:rPr>
-      </w:pPr>
-      <w:r>
-        <w:rPr>
-          <w:b w:val="false"/>
-          <w:bCs w:val="false"/>
-          <w:sz w:val="22"/>
-          <w:szCs w:val="22"/>
-          <w:u w:val="none"/>
-        </w:rPr>
-        <w:t xml:space="preserve">D) [Opção indisponível]</w:t>
-      </w:r>
-    </w:p>
-    <w:p>
-      <w:pPr>
-        <w:pStyle w:val="normal11"/>
-        <w:spacing w:lineRule="auto" w:line="240"/>
-        <w:jc w:val="both"/>
-        <w:rPr>
-          <w:u w:val="none"/>
-        </w:rPr>
-      </w:pPr>
-      <w:r>
-        <w:rPr>
-          <w:b w:val="false"/>
-          <w:bCs w:val="false"/>
-          <w:sz w:val="22"/>
-          <w:szCs w:val="22"/>
-          <w:u w:val="none"/>
-        </w:rPr>
-        <w:t xml:space="preserve">E) [Opção indisponível]</w:t>
+        <w:t xml:space="preserve">47. A Lei nº 13.431, de 4 de abril de 2017 estabelece o sistema de garantia de direitos da criança e do adolescente vítima ou testemunha de violência, alterando inclusive, o Estatuto da Criança e do Adolescente  (Lei nº 8.069, de 13 de julho de 1990 ). Considerando as diretrizes estabelecidas com a "novatio legis", assinale a alternativa incorreta.</w:t>
+      </w:r>
+    </w:p>
+    <w:p>
+      <w:pPr>
+        <w:pStyle w:val="normal11"/>
+        <w:spacing w:lineRule="auto" w:line="240"/>
+        <w:jc w:val="both"/>
+        <w:rPr>
+          <w:u w:val="none"/>
+        </w:rPr>
+      </w:pPr>
+      <w:r>
+        <w:rPr>
+          <w:b w:val="false"/>
+          <w:bCs w:val="false"/>
+          <w:sz w:val="22"/>
+          <w:szCs w:val="22"/>
+          <w:u w:val="none"/>
+        </w:rPr>
+        <w:t xml:space="preserve">A) O depoimento especial reger-se-á por protocolos e, sempre que possível, será realizado uma única vez, em sede de produção antecipada de prova judicial, garantida a ampla defesa do investigado.</w:t>
+      </w:r>
+    </w:p>
+    <w:p>
+      <w:pPr>
+        <w:pStyle w:val="normal11"/>
+        <w:spacing w:lineRule="auto" w:line="240"/>
+        <w:jc w:val="both"/>
+        <w:rPr>
+          <w:u w:val="none"/>
+        </w:rPr>
+      </w:pPr>
+      <w:r>
+        <w:rPr>
+          <w:b w:val="false"/>
+          <w:bCs w:val="false"/>
+          <w:sz w:val="22"/>
+          <w:szCs w:val="22"/>
+          <w:u w:val="none"/>
+        </w:rPr>
+        <w:t xml:space="preserve">B) Em caso de violência sexual, o depoimento especial seguirá o rito cautelar de antecipação de prova.</w:t>
+      </w:r>
+    </w:p>
+    <w:p>
+      <w:pPr>
+        <w:pStyle w:val="normal11"/>
+        <w:spacing w:lineRule="auto" w:line="240"/>
+        <w:jc w:val="both"/>
+        <w:rPr>
+          <w:u w:val="none"/>
+        </w:rPr>
+      </w:pPr>
+      <w:r>
+        <w:rPr>
+          <w:b w:val="false"/>
+          <w:bCs w:val="false"/>
+          <w:sz w:val="22"/>
+          <w:szCs w:val="22"/>
+          <w:u w:val="none"/>
+        </w:rPr>
+        <w:t xml:space="preserve">C) O depoimento especial sempre será gravado em áudio e vídeo e tramitará em segredo de justiça</w:t>
+      </w:r>
+    </w:p>
+    <w:p>
+      <w:pPr>
+        <w:pStyle w:val="normal11"/>
+        <w:spacing w:lineRule="auto" w:line="240"/>
+        <w:jc w:val="both"/>
+        <w:rPr>
+          <w:u w:val="none"/>
+        </w:rPr>
+      </w:pPr>
+      <w:r>
+        <w:rPr>
+          <w:b w:val="false"/>
+          <w:bCs w:val="false"/>
+          <w:sz w:val="22"/>
+          <w:szCs w:val="22"/>
+          <w:u w:val="none"/>
+        </w:rPr>
+        <w:t xml:space="preserve">D) Depoimento especial é o procedimento de entrevista sobre situação de violência com criança ou adolescente perante órgão da rede de proteção, limitado o relato estritamente ao necessário para o cumprimento de sua finalidade.</w:t>
+      </w:r>
+    </w:p>
+    <w:p>
+      <w:pPr>
+        <w:pStyle w:val="normal11"/>
+        <w:spacing w:lineRule="auto" w:line="240"/>
+        <w:jc w:val="both"/>
+        <w:rPr>
+          <w:u w:val="none"/>
+        </w:rPr>
+      </w:pPr>
+      <w:r>
+        <w:rPr>
+          <w:b w:val="false"/>
+          <w:bCs w:val="false"/>
+          <w:sz w:val="22"/>
+          <w:szCs w:val="22"/>
+          <w:u w:val="none"/>
+        </w:rPr>
+        <w:t xml:space="preserve">E) Os profissionais especializados esclarecerão a criança ou o adolescente sobre a tomada do depoimento especial, informando-lhe os seus direitos e os procedimentos a serem adotados e planejando sua participação, sendo vedada a leitura da denúncia ou de outras peças processuais.</w:t>
       </w:r>
     </w:p>
     <w:p>
@@ -13462,107 +13462,107 @@
           <w:szCs w:val="22"/>
           <w:u w:val="none"/>
         </w:rPr>
-        <w:t xml:space="preserve">59. [A questão não possui enunciado]</w:t>
-      </w:r>
-    </w:p>
-    <w:p>
-      <w:pPr>
-        <w:pStyle w:val="normal11"/>
-        <w:spacing w:lineRule="auto" w:line="240"/>
-        <w:jc w:val="both"/>
-        <w:rPr>
-          <w:u w:val="none"/>
-        </w:rPr>
-      </w:pPr>
-      <w:r>
-        <w:rPr>
-          <w:b w:val="false"/>
-          <w:bCs w:val="false"/>
-          <w:sz w:val="22"/>
-          <w:szCs w:val="22"/>
-          <w:u w:val="none"/>
-        </w:rPr>
-        <w:t xml:space="preserve">A) [Opção indisponível]</w:t>
-      </w:r>
-    </w:p>
-    <w:p>
-      <w:pPr>
-        <w:pStyle w:val="normal11"/>
-        <w:spacing w:lineRule="auto" w:line="240"/>
-        <w:jc w:val="both"/>
-        <w:rPr>
-          <w:u w:val="none"/>
-        </w:rPr>
-      </w:pPr>
-      <w:r>
-        <w:rPr>
-          <w:b w:val="false"/>
-          <w:bCs w:val="false"/>
-          <w:sz w:val="22"/>
-          <w:szCs w:val="22"/>
-          <w:u w:val="none"/>
-        </w:rPr>
-        <w:t xml:space="preserve">B) [Opção indisponível]</w:t>
-      </w:r>
-    </w:p>
-    <w:p>
-      <w:pPr>
-        <w:pStyle w:val="normal11"/>
-        <w:spacing w:lineRule="auto" w:line="240"/>
-        <w:jc w:val="both"/>
-        <w:rPr>
-          <w:u w:val="none"/>
-        </w:rPr>
-      </w:pPr>
-      <w:r>
-        <w:rPr>
-          <w:b w:val="false"/>
-          <w:bCs w:val="false"/>
-          <w:sz w:val="22"/>
-          <w:szCs w:val="22"/>
-          <w:u w:val="none"/>
-        </w:rPr>
-        <w:t xml:space="preserve">C) [Opção indisponível]</w:t>
-      </w:r>
-    </w:p>
-    <w:p>
-      <w:pPr>
-        <w:pStyle w:val="normal11"/>
-        <w:spacing w:lineRule="auto" w:line="240"/>
-        <w:jc w:val="both"/>
-        <w:rPr>
-          <w:u w:val="none"/>
-        </w:rPr>
-      </w:pPr>
-      <w:r>
-        <w:rPr>
-          <w:b w:val="false"/>
-          <w:bCs w:val="false"/>
-          <w:sz w:val="22"/>
-          <w:szCs w:val="22"/>
-          <w:u w:val="none"/>
-        </w:rPr>
-        <w:t xml:space="preserve">D) [Opção indisponível]</w:t>
-      </w:r>
-    </w:p>
-    <w:p>
-      <w:pPr>
-        <w:pStyle w:val="normal11"/>
-        <w:spacing w:lineRule="auto" w:line="240"/>
-        <w:jc w:val="both"/>
-        <w:rPr>
-          <w:u w:val="none"/>
-        </w:rPr>
-      </w:pPr>
-      <w:r>
-        <w:rPr>
-          <w:b w:val="false"/>
-          <w:bCs w:val="false"/>
-          <w:sz w:val="22"/>
-          <w:szCs w:val="22"/>
-          <w:u w:val="none"/>
-        </w:rPr>
-        <w:t xml:space="preserve">E) [Opção indisponível]</w:t>
+        <w:t xml:space="preserve">59. De acordo com a apresentação, as plataformas fornecem diferentes conjuntos de dados dependendo de a requisição ser extrajudicial ou judicial. Qual das seguintes informações o WhatsApp fornece apenas mediante ordem judicial?</w:t>
+      </w:r>
+    </w:p>
+    <w:p>
+      <w:pPr>
+        <w:pStyle w:val="normal11"/>
+        <w:spacing w:lineRule="auto" w:line="240"/>
+        <w:jc w:val="both"/>
+        <w:rPr>
+          <w:u w:val="none"/>
+        </w:rPr>
+      </w:pPr>
+      <w:r>
+        <w:rPr>
+          <w:b w:val="false"/>
+          <w:bCs w:val="false"/>
+          <w:sz w:val="22"/>
+          <w:szCs w:val="22"/>
+          <w:u w:val="none"/>
+        </w:rPr>
+        <w:t xml:space="preserve">A) A lista de contatos simétrica e assimétrica.</w:t>
+      </w:r>
+    </w:p>
+    <w:p>
+      <w:pPr>
+        <w:pStyle w:val="normal11"/>
+        <w:spacing w:lineRule="auto" w:line="240"/>
+        <w:jc w:val="both"/>
+        <w:rPr>
+          <w:u w:val="none"/>
+        </w:rPr>
+      </w:pPr>
+      <w:r>
+        <w:rPr>
+          <w:b w:val="false"/>
+          <w:bCs w:val="false"/>
+          <w:sz w:val="22"/>
+          <w:szCs w:val="22"/>
+          <w:u w:val="none"/>
+        </w:rPr>
+        <w:t xml:space="preserve">B) A data e o horário do registro da conta.</w:t>
+      </w:r>
+    </w:p>
+    <w:p>
+      <w:pPr>
+        <w:pStyle w:val="normal11"/>
+        <w:spacing w:lineRule="auto" w:line="240"/>
+        <w:jc w:val="both"/>
+        <w:rPr>
+          <w:u w:val="none"/>
+        </w:rPr>
+      </w:pPr>
+      <w:r>
+        <w:rPr>
+          <w:b w:val="false"/>
+          <w:bCs w:val="false"/>
+          <w:sz w:val="22"/>
+          <w:szCs w:val="22"/>
+          <w:u w:val="none"/>
+        </w:rPr>
+        <w:t xml:space="preserve">C) O endereço de e-mail associado à conta.</w:t>
+      </w:r>
+    </w:p>
+    <w:p>
+      <w:pPr>
+        <w:pStyle w:val="normal11"/>
+        <w:spacing w:lineRule="auto" w:line="240"/>
+        <w:jc w:val="both"/>
+        <w:rPr>
+          <w:u w:val="none"/>
+        </w:rPr>
+      </w:pPr>
+      <w:r>
+        <w:rPr>
+          <w:b w:val="false"/>
+          <w:bCs w:val="false"/>
+          <w:sz w:val="22"/>
+          <w:szCs w:val="22"/>
+          <w:u w:val="none"/>
+        </w:rPr>
+        <w:t xml:space="preserve">D) A versão do aplicativo e o sistema operacional.</w:t>
+      </w:r>
+    </w:p>
+    <w:p>
+      <w:pPr>
+        <w:pStyle w:val="normal11"/>
+        <w:spacing w:lineRule="auto" w:line="240"/>
+        <w:jc w:val="both"/>
+        <w:rPr>
+          <w:u w:val="none"/>
+        </w:rPr>
+      </w:pPr>
+      <w:r>
+        <w:rPr>
+          <w:b w:val="false"/>
+          <w:bCs w:val="false"/>
+          <w:sz w:val="22"/>
+          <w:szCs w:val="22"/>
+          <w:u w:val="none"/>
+        </w:rPr>
+        <w:t xml:space="preserve">E) Nenhuma das alternativas acima</w:t>
       </w:r>
     </w:p>
     <w:p>
@@ -13603,107 +13603,107 @@
           <w:szCs w:val="22"/>
           <w:u w:val="none"/>
         </w:rPr>
-        <w:t xml:space="preserve">60. [A questão não possui enunciado]</w:t>
-      </w:r>
-    </w:p>
-    <w:p>
-      <w:pPr>
-        <w:pStyle w:val="normal11"/>
-        <w:spacing w:lineRule="auto" w:line="240"/>
-        <w:jc w:val="both"/>
-        <w:rPr>
-          <w:u w:val="none"/>
-        </w:rPr>
-      </w:pPr>
-      <w:r>
-        <w:rPr>
-          <w:b w:val="false"/>
-          <w:bCs w:val="false"/>
-          <w:sz w:val="22"/>
-          <w:szCs w:val="22"/>
-          <w:u w:val="none"/>
-        </w:rPr>
-        <w:t xml:space="preserve">A) [Opção indisponível]</w:t>
-      </w:r>
-    </w:p>
-    <w:p>
-      <w:pPr>
-        <w:pStyle w:val="normal11"/>
-        <w:spacing w:lineRule="auto" w:line="240"/>
-        <w:jc w:val="both"/>
-        <w:rPr>
-          <w:u w:val="none"/>
-        </w:rPr>
-      </w:pPr>
-      <w:r>
-        <w:rPr>
-          <w:b w:val="false"/>
-          <w:bCs w:val="false"/>
-          <w:sz w:val="22"/>
-          <w:szCs w:val="22"/>
-          <w:u w:val="none"/>
-        </w:rPr>
-        <w:t xml:space="preserve">B) [Opção indisponível]</w:t>
-      </w:r>
-    </w:p>
-    <w:p>
-      <w:pPr>
-        <w:pStyle w:val="normal11"/>
-        <w:spacing w:lineRule="auto" w:line="240"/>
-        <w:jc w:val="both"/>
-        <w:rPr>
-          <w:u w:val="none"/>
-        </w:rPr>
-      </w:pPr>
-      <w:r>
-        <w:rPr>
-          <w:b w:val="false"/>
-          <w:bCs w:val="false"/>
-          <w:sz w:val="22"/>
-          <w:szCs w:val="22"/>
-          <w:u w:val="none"/>
-        </w:rPr>
-        <w:t xml:space="preserve">C) [Opção indisponível]</w:t>
-      </w:r>
-    </w:p>
-    <w:p>
-      <w:pPr>
-        <w:pStyle w:val="normal11"/>
-        <w:spacing w:lineRule="auto" w:line="240"/>
-        <w:jc w:val="both"/>
-        <w:rPr>
-          <w:u w:val="none"/>
-        </w:rPr>
-      </w:pPr>
-      <w:r>
-        <w:rPr>
-          <w:b w:val="false"/>
-          <w:bCs w:val="false"/>
-          <w:sz w:val="22"/>
-          <w:szCs w:val="22"/>
-          <w:u w:val="none"/>
-        </w:rPr>
-        <w:t xml:space="preserve">D) [Opção indisponível]</w:t>
-      </w:r>
-    </w:p>
-    <w:p>
-      <w:pPr>
-        <w:pStyle w:val="normal11"/>
-        <w:spacing w:lineRule="auto" w:line="240"/>
-        <w:jc w:val="both"/>
-        <w:rPr>
-          <w:u w:val="none"/>
-        </w:rPr>
-      </w:pPr>
-      <w:r>
-        <w:rPr>
-          <w:b w:val="false"/>
-          <w:bCs w:val="false"/>
-          <w:sz w:val="22"/>
-          <w:szCs w:val="22"/>
-          <w:u w:val="none"/>
-        </w:rPr>
-        <w:t xml:space="preserve">E) [Opção indisponível]</w:t>
+        <w:t xml:space="preserve">60. Para realizar uma requisição de dados junto à Meta Platforms (Facebook/Instagram), a autoridade policial deve fornecer identificadores específicos. Segundo o material, qual conjunto representa os identificadores corretos para esta plataforma?</w:t>
+      </w:r>
+    </w:p>
+    <w:p>
+      <w:pPr>
+        <w:pStyle w:val="normal11"/>
+        <w:spacing w:lineRule="auto" w:line="240"/>
+        <w:jc w:val="both"/>
+        <w:rPr>
+          <w:u w:val="none"/>
+        </w:rPr>
+      </w:pPr>
+      <w:r>
+        <w:rPr>
+          <w:b w:val="false"/>
+          <w:bCs w:val="false"/>
+          <w:sz w:val="22"/>
+          <w:szCs w:val="22"/>
+          <w:u w:val="none"/>
+        </w:rPr>
+        <w:t xml:space="preserve">A) User ID, Nome de usuário, E-mail e Telefone.</w:t>
+      </w:r>
+    </w:p>
+    <w:p>
+      <w:pPr>
+        <w:pStyle w:val="normal11"/>
+        <w:spacing w:lineRule="auto" w:line="240"/>
+        <w:jc w:val="both"/>
+        <w:rPr>
+          <w:u w:val="none"/>
+        </w:rPr>
+      </w:pPr>
+      <w:r>
+        <w:rPr>
+          <w:b w:val="false"/>
+          <w:bCs w:val="false"/>
+          <w:sz w:val="22"/>
+          <w:szCs w:val="22"/>
+          <w:u w:val="none"/>
+        </w:rPr>
+        <w:t xml:space="preserve">B) Conta Google, IMEI verificado, URL e Chave PIX.</w:t>
+      </w:r>
+    </w:p>
+    <w:p>
+      <w:pPr>
+        <w:pStyle w:val="normal11"/>
+        <w:spacing w:lineRule="auto" w:line="240"/>
+        <w:jc w:val="both"/>
+        <w:rPr>
+          <w:u w:val="none"/>
+        </w:rPr>
+      </w:pPr>
+      <w:r>
+        <w:rPr>
+          <w:b w:val="false"/>
+          <w:bCs w:val="false"/>
+          <w:sz w:val="22"/>
+          <w:szCs w:val="22"/>
+          <w:u w:val="none"/>
+        </w:rPr>
+        <w:t xml:space="preserve">C) ID do usuário, Nome com hashtag, E-mail e CPF.</w:t>
+      </w:r>
+    </w:p>
+    <w:p>
+      <w:pPr>
+        <w:pStyle w:val="normal11"/>
+        <w:spacing w:lineRule="auto" w:line="240"/>
+        <w:jc w:val="both"/>
+        <w:rPr>
+          <w:u w:val="none"/>
+        </w:rPr>
+      </w:pPr>
+      <w:r>
+        <w:rPr>
+          <w:b w:val="false"/>
+          <w:bCs w:val="false"/>
+          <w:sz w:val="22"/>
+          <w:szCs w:val="22"/>
+          <w:u w:val="none"/>
+        </w:rPr>
+        <w:t xml:space="preserve">D) ID Apple, DS ID, IMEI e Número de Telefone.</w:t>
+      </w:r>
+    </w:p>
+    <w:p>
+      <w:pPr>
+        <w:pStyle w:val="normal11"/>
+        <w:spacing w:lineRule="auto" w:line="240"/>
+        <w:jc w:val="both"/>
+        <w:rPr>
+          <w:u w:val="none"/>
+        </w:rPr>
+      </w:pPr>
+      <w:r>
+        <w:rPr>
+          <w:b w:val="false"/>
+          <w:bCs w:val="false"/>
+          <w:sz w:val="22"/>
+          <w:szCs w:val="22"/>
+          <w:u w:val="none"/>
+        </w:rPr>
+        <w:t xml:space="preserve">E) Nenhuma das alternativas acima</w:t>
       </w:r>
     </w:p>
     <w:p>
@@ -16408,107 +16408,107 @@
           <w:szCs w:val="22"/>
           <w:u w:val="none"/>
         </w:rPr>
-        <w:t xml:space="preserve">78. [A questão não possui enunciado]</w:t>
-      </w:r>
-    </w:p>
-    <w:p>
-      <w:pPr>
-        <w:pStyle w:val="normal11"/>
-        <w:spacing w:lineRule="auto" w:line="240"/>
-        <w:jc w:val="both"/>
-        <w:rPr>
-          <w:u w:val="none"/>
-        </w:rPr>
-      </w:pPr>
-      <w:r>
-        <w:rPr>
-          <w:b w:val="false"/>
-          <w:bCs w:val="false"/>
-          <w:sz w:val="22"/>
-          <w:szCs w:val="22"/>
-          <w:u w:val="none"/>
-        </w:rPr>
-        <w:t xml:space="preserve">A) [Opção indisponível]</w:t>
-      </w:r>
-    </w:p>
-    <w:p>
-      <w:pPr>
-        <w:pStyle w:val="normal11"/>
-        <w:spacing w:lineRule="auto" w:line="240"/>
-        <w:jc w:val="both"/>
-        <w:rPr>
-          <w:u w:val="none"/>
-        </w:rPr>
-      </w:pPr>
-      <w:r>
-        <w:rPr>
-          <w:b w:val="false"/>
-          <w:bCs w:val="false"/>
-          <w:sz w:val="22"/>
-          <w:szCs w:val="22"/>
-          <w:u w:val="none"/>
-        </w:rPr>
-        <w:t xml:space="preserve">B) [Opção indisponível]</w:t>
-      </w:r>
-    </w:p>
-    <w:p>
-      <w:pPr>
-        <w:pStyle w:val="normal11"/>
-        <w:spacing w:lineRule="auto" w:line="240"/>
-        <w:jc w:val="both"/>
-        <w:rPr>
-          <w:u w:val="none"/>
-        </w:rPr>
-      </w:pPr>
-      <w:r>
-        <w:rPr>
-          <w:b w:val="false"/>
-          <w:bCs w:val="false"/>
-          <w:sz w:val="22"/>
-          <w:szCs w:val="22"/>
-          <w:u w:val="none"/>
-        </w:rPr>
-        <w:t xml:space="preserve">C) [Opção indisponível]</w:t>
-      </w:r>
-    </w:p>
-    <w:p>
-      <w:pPr>
-        <w:pStyle w:val="normal11"/>
-        <w:spacing w:lineRule="auto" w:line="240"/>
-        <w:jc w:val="both"/>
-        <w:rPr>
-          <w:u w:val="none"/>
-        </w:rPr>
-      </w:pPr>
-      <w:r>
-        <w:rPr>
-          <w:b w:val="false"/>
-          <w:bCs w:val="false"/>
-          <w:sz w:val="22"/>
-          <w:szCs w:val="22"/>
-          <w:u w:val="none"/>
-        </w:rPr>
-        <w:t xml:space="preserve">D) [Opção indisponível]</w:t>
-      </w:r>
-    </w:p>
-    <w:p>
-      <w:pPr>
-        <w:pStyle w:val="normal11"/>
-        <w:spacing w:lineRule="auto" w:line="240"/>
-        <w:jc w:val="both"/>
-        <w:rPr>
-          <w:u w:val="none"/>
-        </w:rPr>
-      </w:pPr>
-      <w:r>
-        <w:rPr>
-          <w:b w:val="false"/>
-          <w:bCs w:val="false"/>
-          <w:sz w:val="22"/>
-          <w:szCs w:val="22"/>
-          <w:u w:val="none"/>
-        </w:rPr>
-        <w:t xml:space="preserve">E) [Opção indisponível]</w:t>
+        <w:t xml:space="preserve">78. Analise a lesão abaixo e pode concluir que:</w:t>
+      </w:r>
+    </w:p>
+    <w:p>
+      <w:pPr>
+        <w:pStyle w:val="normal11"/>
+        <w:spacing w:lineRule="auto" w:line="240"/>
+        <w:jc w:val="both"/>
+        <w:rPr>
+          <w:u w:val="none"/>
+        </w:rPr>
+      </w:pPr>
+      <w:r>
+        <w:rPr>
+          <w:b w:val="false"/>
+          <w:bCs w:val="false"/>
+          <w:sz w:val="22"/>
+          <w:szCs w:val="22"/>
+          <w:u w:val="none"/>
+        </w:rPr>
+        <w:t xml:space="preserve">A) A distância do disparo foi de mais de dois metros.</w:t>
+      </w:r>
+    </w:p>
+    <w:p>
+      <w:pPr>
+        <w:pStyle w:val="normal11"/>
+        <w:spacing w:lineRule="auto" w:line="240"/>
+        <w:jc w:val="both"/>
+        <w:rPr>
+          <w:u w:val="none"/>
+        </w:rPr>
+      </w:pPr>
+      <w:r>
+        <w:rPr>
+          <w:b w:val="false"/>
+          <w:bCs w:val="false"/>
+          <w:sz w:val="22"/>
+          <w:szCs w:val="22"/>
+          <w:u w:val="none"/>
+        </w:rPr>
+        <w:t xml:space="preserve">B) O disparo foi com o cano da arma encostado.</w:t>
+      </w:r>
+    </w:p>
+    <w:p>
+      <w:pPr>
+        <w:pStyle w:val="normal11"/>
+        <w:spacing w:lineRule="auto" w:line="240"/>
+        <w:jc w:val="both"/>
+        <w:rPr>
+          <w:u w:val="none"/>
+        </w:rPr>
+      </w:pPr>
+      <w:r>
+        <w:rPr>
+          <w:b w:val="false"/>
+          <w:bCs w:val="false"/>
+          <w:sz w:val="22"/>
+          <w:szCs w:val="22"/>
+          <w:u w:val="none"/>
+        </w:rPr>
+        <w:t xml:space="preserve">C) O disparo foi de longa distância após a morte.</w:t>
+      </w:r>
+    </w:p>
+    <w:p>
+      <w:pPr>
+        <w:pStyle w:val="normal11"/>
+        <w:spacing w:lineRule="auto" w:line="240"/>
+        <w:jc w:val="both"/>
+        <w:rPr>
+          <w:u w:val="none"/>
+        </w:rPr>
+      </w:pPr>
+      <w:r>
+        <w:rPr>
+          <w:b w:val="false"/>
+          <w:bCs w:val="false"/>
+          <w:sz w:val="22"/>
+          <w:szCs w:val="22"/>
+          <w:u w:val="none"/>
+        </w:rPr>
+        <w:t xml:space="preserve">D) Observa-se nitidamente a Câmara de Mina de Hoffmann.</w:t>
+      </w:r>
+    </w:p>
+    <w:p>
+      <w:pPr>
+        <w:pStyle w:val="normal11"/>
+        <w:spacing w:lineRule="auto" w:line="240"/>
+        <w:jc w:val="both"/>
+        <w:rPr>
+          <w:u w:val="none"/>
+        </w:rPr>
+      </w:pPr>
+      <w:r>
+        <w:rPr>
+          <w:b w:val="false"/>
+          <w:bCs w:val="false"/>
+          <w:sz w:val="22"/>
+          <w:szCs w:val="22"/>
+          <w:u w:val="none"/>
+        </w:rPr>
+        <w:t xml:space="preserve">E) O disparo foi de curta distância.</w:t>
       </w:r>
     </w:p>
     <w:p>
@@ -16549,107 +16549,107 @@
           <w:szCs w:val="22"/>
           <w:u w:val="none"/>
         </w:rPr>
-        <w:t xml:space="preserve">79. [A questão não possui enunciado]</w:t>
-      </w:r>
-    </w:p>
-    <w:p>
-      <w:pPr>
-        <w:pStyle w:val="normal11"/>
-        <w:spacing w:lineRule="auto" w:line="240"/>
-        <w:jc w:val="both"/>
-        <w:rPr>
-          <w:u w:val="none"/>
-        </w:rPr>
-      </w:pPr>
-      <w:r>
-        <w:rPr>
-          <w:b w:val="false"/>
-          <w:bCs w:val="false"/>
-          <w:sz w:val="22"/>
-          <w:szCs w:val="22"/>
-          <w:u w:val="none"/>
-        </w:rPr>
-        <w:t xml:space="preserve">A) [Opção indisponível]</w:t>
-      </w:r>
-    </w:p>
-    <w:p>
-      <w:pPr>
-        <w:pStyle w:val="normal11"/>
-        <w:spacing w:lineRule="auto" w:line="240"/>
-        <w:jc w:val="both"/>
-        <w:rPr>
-          <w:u w:val="none"/>
-        </w:rPr>
-      </w:pPr>
-      <w:r>
-        <w:rPr>
-          <w:b w:val="false"/>
-          <w:bCs w:val="false"/>
-          <w:sz w:val="22"/>
-          <w:szCs w:val="22"/>
-          <w:u w:val="none"/>
-        </w:rPr>
-        <w:t xml:space="preserve">B) [Opção indisponível]</w:t>
-      </w:r>
-    </w:p>
-    <w:p>
-      <w:pPr>
-        <w:pStyle w:val="normal11"/>
-        <w:spacing w:lineRule="auto" w:line="240"/>
-        <w:jc w:val="both"/>
-        <w:rPr>
-          <w:u w:val="none"/>
-        </w:rPr>
-      </w:pPr>
-      <w:r>
-        <w:rPr>
-          <w:b w:val="false"/>
-          <w:bCs w:val="false"/>
-          <w:sz w:val="22"/>
-          <w:szCs w:val="22"/>
-          <w:u w:val="none"/>
-        </w:rPr>
-        <w:t xml:space="preserve">C) [Opção indisponível]</w:t>
-      </w:r>
-    </w:p>
-    <w:p>
-      <w:pPr>
-        <w:pStyle w:val="normal11"/>
-        <w:spacing w:lineRule="auto" w:line="240"/>
-        <w:jc w:val="both"/>
-        <w:rPr>
-          <w:u w:val="none"/>
-        </w:rPr>
-      </w:pPr>
-      <w:r>
-        <w:rPr>
-          <w:b w:val="false"/>
-          <w:bCs w:val="false"/>
-          <w:sz w:val="22"/>
-          <w:szCs w:val="22"/>
-          <w:u w:val="none"/>
-        </w:rPr>
-        <w:t xml:space="preserve">D) [Opção indisponível]</w:t>
-      </w:r>
-    </w:p>
-    <w:p>
-      <w:pPr>
-        <w:pStyle w:val="normal11"/>
-        <w:spacing w:lineRule="auto" w:line="240"/>
-        <w:jc w:val="both"/>
-        <w:rPr>
-          <w:u w:val="none"/>
-        </w:rPr>
-      </w:pPr>
-      <w:r>
-        <w:rPr>
-          <w:b w:val="false"/>
-          <w:bCs w:val="false"/>
-          <w:sz w:val="22"/>
-          <w:szCs w:val="22"/>
-          <w:u w:val="none"/>
-        </w:rPr>
-        <w:t xml:space="preserve">E) [Opção indisponível]</w:t>
+        <w:t xml:space="preserve">79. Com relação a arcada dentária e DNA para identificação judiciária, assinale a alternativa correta.</w:t>
+      </w:r>
+    </w:p>
+    <w:p>
+      <w:pPr>
+        <w:pStyle w:val="normal11"/>
+        <w:spacing w:lineRule="auto" w:line="240"/>
+        <w:jc w:val="both"/>
+        <w:rPr>
+          <w:u w:val="none"/>
+        </w:rPr>
+      </w:pPr>
+      <w:r>
+        <w:rPr>
+          <w:b w:val="false"/>
+          <w:bCs w:val="false"/>
+          <w:sz w:val="22"/>
+          <w:szCs w:val="22"/>
+          <w:u w:val="none"/>
+        </w:rPr>
+        <w:t xml:space="preserve">A) Ambos são imutáveis e ainda o DNA não pode ser classificado.</w:t>
+      </w:r>
+    </w:p>
+    <w:p>
+      <w:pPr>
+        <w:pStyle w:val="normal11"/>
+        <w:spacing w:lineRule="auto" w:line="240"/>
+        <w:jc w:val="both"/>
+        <w:rPr>
+          <w:u w:val="none"/>
+        </w:rPr>
+      </w:pPr>
+      <w:r>
+        <w:rPr>
+          <w:b w:val="false"/>
+          <w:bCs w:val="false"/>
+          <w:sz w:val="22"/>
+          <w:szCs w:val="22"/>
+          <w:u w:val="none"/>
+        </w:rPr>
+        <w:t xml:space="preserve">B) A arcada dentária tem resultado mais demorado em razão da procura de arquivo para comparação, enquanto o DNA não tem esse empecilho.</w:t>
+      </w:r>
+    </w:p>
+    <w:p>
+      <w:pPr>
+        <w:pStyle w:val="normal11"/>
+        <w:spacing w:lineRule="auto" w:line="240"/>
+        <w:jc w:val="both"/>
+        <w:rPr>
+          <w:u w:val="none"/>
+        </w:rPr>
+      </w:pPr>
+      <w:r>
+        <w:rPr>
+          <w:b w:val="false"/>
+          <w:bCs w:val="false"/>
+          <w:sz w:val="22"/>
+          <w:szCs w:val="22"/>
+          <w:u w:val="none"/>
+        </w:rPr>
+        <w:t xml:space="preserve">C) A arcada dentária pode ser utilizada para identificação de corpos em putrefação avançada, o DNA nesta caso não pode em virtude da destruição dos tecidos.</w:t>
+      </w:r>
+    </w:p>
+    <w:p>
+      <w:pPr>
+        <w:pStyle w:val="normal11"/>
+        <w:spacing w:lineRule="auto" w:line="240"/>
+        <w:jc w:val="both"/>
+        <w:rPr>
+          <w:u w:val="none"/>
+        </w:rPr>
+      </w:pPr>
+      <w:r>
+        <w:rPr>
+          <w:b w:val="false"/>
+          <w:bCs w:val="false"/>
+          <w:sz w:val="22"/>
+          <w:szCs w:val="22"/>
+          <w:u w:val="none"/>
+        </w:rPr>
+        <w:t xml:space="preserve">D) Uma desvantagem da identificação pela arcada dentária é o fato dela ser mutável com o tempo ou por vontade.</w:t>
+      </w:r>
+    </w:p>
+    <w:p>
+      <w:pPr>
+        <w:pStyle w:val="normal11"/>
+        <w:spacing w:lineRule="auto" w:line="240"/>
+        <w:jc w:val="both"/>
+        <w:rPr>
+          <w:u w:val="none"/>
+        </w:rPr>
+      </w:pPr>
+      <w:r>
+        <w:rPr>
+          <w:b w:val="false"/>
+          <w:bCs w:val="false"/>
+          <w:sz w:val="22"/>
+          <w:szCs w:val="22"/>
+          <w:u w:val="none"/>
+        </w:rPr>
+        <w:t xml:space="preserve">E) O DNA tem mais confiabilidade em razão de ser imutável, por isso é considerado o método perfeito.</w:t>
       </w:r>
     </w:p>
     <w:p>
@@ -16690,107 +16690,107 @@
           <w:szCs w:val="22"/>
           <w:u w:val="none"/>
         </w:rPr>
-        <w:t xml:space="preserve">80. [A questão não possui enunciado]</w:t>
-      </w:r>
-    </w:p>
-    <w:p>
-      <w:pPr>
-        <w:pStyle w:val="normal11"/>
-        <w:spacing w:lineRule="auto" w:line="240"/>
-        <w:jc w:val="both"/>
-        <w:rPr>
-          <w:u w:val="none"/>
-        </w:rPr>
-      </w:pPr>
-      <w:r>
-        <w:rPr>
-          <w:b w:val="false"/>
-          <w:bCs w:val="false"/>
-          <w:sz w:val="22"/>
-          <w:szCs w:val="22"/>
-          <w:u w:val="none"/>
-        </w:rPr>
-        <w:t xml:space="preserve">A) [Opção indisponível]</w:t>
-      </w:r>
-    </w:p>
-    <w:p>
-      <w:pPr>
-        <w:pStyle w:val="normal11"/>
-        <w:spacing w:lineRule="auto" w:line="240"/>
-        <w:jc w:val="both"/>
-        <w:rPr>
-          <w:u w:val="none"/>
-        </w:rPr>
-      </w:pPr>
-      <w:r>
-        <w:rPr>
-          <w:b w:val="false"/>
-          <w:bCs w:val="false"/>
-          <w:sz w:val="22"/>
-          <w:szCs w:val="22"/>
-          <w:u w:val="none"/>
-        </w:rPr>
-        <w:t xml:space="preserve">B) [Opção indisponível]</w:t>
-      </w:r>
-    </w:p>
-    <w:p>
-      <w:pPr>
-        <w:pStyle w:val="normal11"/>
-        <w:spacing w:lineRule="auto" w:line="240"/>
-        <w:jc w:val="both"/>
-        <w:rPr>
-          <w:u w:val="none"/>
-        </w:rPr>
-      </w:pPr>
-      <w:r>
-        <w:rPr>
-          <w:b w:val="false"/>
-          <w:bCs w:val="false"/>
-          <w:sz w:val="22"/>
-          <w:szCs w:val="22"/>
-          <w:u w:val="none"/>
-        </w:rPr>
-        <w:t xml:space="preserve">C) [Opção indisponível]</w:t>
-      </w:r>
-    </w:p>
-    <w:p>
-      <w:pPr>
-        <w:pStyle w:val="normal11"/>
-        <w:spacing w:lineRule="auto" w:line="240"/>
-        <w:jc w:val="both"/>
-        <w:rPr>
-          <w:u w:val="none"/>
-        </w:rPr>
-      </w:pPr>
-      <w:r>
-        <w:rPr>
-          <w:b w:val="false"/>
-          <w:bCs w:val="false"/>
-          <w:sz w:val="22"/>
-          <w:szCs w:val="22"/>
-          <w:u w:val="none"/>
-        </w:rPr>
-        <w:t xml:space="preserve">D) [Opção indisponível]</w:t>
-      </w:r>
-    </w:p>
-    <w:p>
-      <w:pPr>
-        <w:pStyle w:val="normal11"/>
-        <w:spacing w:lineRule="auto" w:line="240"/>
-        <w:jc w:val="both"/>
-        <w:rPr>
-          <w:u w:val="none"/>
-        </w:rPr>
-      </w:pPr>
-      <w:r>
-        <w:rPr>
-          <w:b w:val="false"/>
-          <w:bCs w:val="false"/>
-          <w:sz w:val="22"/>
-          <w:szCs w:val="22"/>
-          <w:u w:val="none"/>
-        </w:rPr>
-        <w:t xml:space="preserve">E) [Opção indisponível]</w:t>
+        <w:t xml:space="preserve">80. Quanto a classificação dos projéteis de armas de fogo responda: os projéteis deformáveis foram desenvolvidos para:</w:t>
+      </w:r>
+    </w:p>
+    <w:p>
+      <w:pPr>
+        <w:pStyle w:val="normal11"/>
+        <w:spacing w:lineRule="auto" w:line="240"/>
+        <w:jc w:val="both"/>
+        <w:rPr>
+          <w:u w:val="none"/>
+        </w:rPr>
+      </w:pPr>
+      <w:r>
+        <w:rPr>
+          <w:b w:val="false"/>
+          <w:bCs w:val="false"/>
+          <w:sz w:val="22"/>
+          <w:szCs w:val="22"/>
+          <w:u w:val="none"/>
+        </w:rPr>
+        <w:t xml:space="preserve">A) Aumentar a velocidade do projétil .</w:t>
+      </w:r>
+    </w:p>
+    <w:p>
+      <w:pPr>
+        <w:pStyle w:val="normal11"/>
+        <w:spacing w:lineRule="auto" w:line="240"/>
+        <w:jc w:val="both"/>
+        <w:rPr>
+          <w:u w:val="none"/>
+        </w:rPr>
+      </w:pPr>
+      <w:r>
+        <w:rPr>
+          <w:b w:val="false"/>
+          <w:bCs w:val="false"/>
+          <w:sz w:val="22"/>
+          <w:szCs w:val="22"/>
+          <w:u w:val="none"/>
+        </w:rPr>
+        <w:t xml:space="preserve">B) Aumentar a energia dissipada no alvo ocasionando maior lesão.</w:t>
+      </w:r>
+    </w:p>
+    <w:p>
+      <w:pPr>
+        <w:pStyle w:val="normal11"/>
+        <w:spacing w:lineRule="auto" w:line="240"/>
+        <w:jc w:val="both"/>
+        <w:rPr>
+          <w:u w:val="none"/>
+        </w:rPr>
+      </w:pPr>
+      <w:r>
+        <w:rPr>
+          <w:b w:val="false"/>
+          <w:bCs w:val="false"/>
+          <w:sz w:val="22"/>
+          <w:szCs w:val="22"/>
+          <w:u w:val="none"/>
+        </w:rPr>
+        <w:t xml:space="preserve">C) Atingir grandes distâncias de acordo com a balística externa.</w:t>
+      </w:r>
+    </w:p>
+    <w:p>
+      <w:pPr>
+        <w:pStyle w:val="normal11"/>
+        <w:spacing w:lineRule="auto" w:line="240"/>
+        <w:jc w:val="both"/>
+        <w:rPr>
+          <w:u w:val="none"/>
+        </w:rPr>
+      </w:pPr>
+      <w:r>
+        <w:rPr>
+          <w:b w:val="false"/>
+          <w:bCs w:val="false"/>
+          <w:sz w:val="22"/>
+          <w:szCs w:val="22"/>
+          <w:u w:val="none"/>
+        </w:rPr>
+        <w:t xml:space="preserve">D) Transfixar os corpos das vítimas com sobra de energia.</w:t>
+      </w:r>
+    </w:p>
+    <w:p>
+      <w:pPr>
+        <w:pStyle w:val="normal11"/>
+        <w:spacing w:lineRule="auto" w:line="240"/>
+        <w:jc w:val="both"/>
+        <w:rPr>
+          <w:u w:val="none"/>
+        </w:rPr>
+      </w:pPr>
+      <w:r>
+        <w:rPr>
+          <w:b w:val="false"/>
+          <w:bCs w:val="false"/>
+          <w:sz w:val="22"/>
+          <w:szCs w:val="22"/>
+          <w:u w:val="none"/>
+        </w:rPr>
+        <w:t xml:space="preserve">E) Diminuir a letalidade dos disparos da polícia.</w:t>
       </w:r>
     </w:p>
     <w:p>
@@ -16831,107 +16831,107 @@
           <w:szCs w:val="22"/>
           <w:u w:val="none"/>
         </w:rPr>
-        <w:t xml:space="preserve">81. [A questão não possui enunciado]</w:t>
-      </w:r>
-    </w:p>
-    <w:p>
-      <w:pPr>
-        <w:pStyle w:val="normal11"/>
-        <w:spacing w:lineRule="auto" w:line="240"/>
-        <w:jc w:val="both"/>
-        <w:rPr>
-          <w:u w:val="none"/>
-        </w:rPr>
-      </w:pPr>
-      <w:r>
-        <w:rPr>
-          <w:b w:val="false"/>
-          <w:bCs w:val="false"/>
-          <w:sz w:val="22"/>
-          <w:szCs w:val="22"/>
-          <w:u w:val="none"/>
-        </w:rPr>
-        <w:t xml:space="preserve">A) [Opção indisponível]</w:t>
-      </w:r>
-    </w:p>
-    <w:p>
-      <w:pPr>
-        <w:pStyle w:val="normal11"/>
-        <w:spacing w:lineRule="auto" w:line="240"/>
-        <w:jc w:val="both"/>
-        <w:rPr>
-          <w:u w:val="none"/>
-        </w:rPr>
-      </w:pPr>
-      <w:r>
-        <w:rPr>
-          <w:b w:val="false"/>
-          <w:bCs w:val="false"/>
-          <w:sz w:val="22"/>
-          <w:szCs w:val="22"/>
-          <w:u w:val="none"/>
-        </w:rPr>
-        <w:t xml:space="preserve">B) [Opção indisponível]</w:t>
-      </w:r>
-    </w:p>
-    <w:p>
-      <w:pPr>
-        <w:pStyle w:val="normal11"/>
-        <w:spacing w:lineRule="auto" w:line="240"/>
-        <w:jc w:val="both"/>
-        <w:rPr>
-          <w:u w:val="none"/>
-        </w:rPr>
-      </w:pPr>
-      <w:r>
-        <w:rPr>
-          <w:b w:val="false"/>
-          <w:bCs w:val="false"/>
-          <w:sz w:val="22"/>
-          <w:szCs w:val="22"/>
-          <w:u w:val="none"/>
-        </w:rPr>
-        <w:t xml:space="preserve">C) [Opção indisponível]</w:t>
-      </w:r>
-    </w:p>
-    <w:p>
-      <w:pPr>
-        <w:pStyle w:val="normal11"/>
-        <w:spacing w:lineRule="auto" w:line="240"/>
-        <w:jc w:val="both"/>
-        <w:rPr>
-          <w:u w:val="none"/>
-        </w:rPr>
-      </w:pPr>
-      <w:r>
-        <w:rPr>
-          <w:b w:val="false"/>
-          <w:bCs w:val="false"/>
-          <w:sz w:val="22"/>
-          <w:szCs w:val="22"/>
-          <w:u w:val="none"/>
-        </w:rPr>
-        <w:t xml:space="preserve">D) [Opção indisponível]</w:t>
-      </w:r>
-    </w:p>
-    <w:p>
-      <w:pPr>
-        <w:pStyle w:val="normal11"/>
-        <w:spacing w:lineRule="auto" w:line="240"/>
-        <w:jc w:val="both"/>
-        <w:rPr>
-          <w:u w:val="none"/>
-        </w:rPr>
-      </w:pPr>
-      <w:r>
-        <w:rPr>
-          <w:b w:val="false"/>
-          <w:bCs w:val="false"/>
-          <w:sz w:val="22"/>
-          <w:szCs w:val="22"/>
-          <w:u w:val="none"/>
-        </w:rPr>
-        <w:t xml:space="preserve">E) [Opção indisponível]</w:t>
+        <w:t xml:space="preserve">81. Uma vítima de acidente de trânsito sofreu fratura de fêmur direito e traumatismo craniano. Ficou internado por 45 dias e teve alta hospitalar com pequena sequela neurológica. Após 15 dias apresenta quadro infeccioso pulmonar, retorna ao hospital e morre no sexto dia de internamento. Qual a conduta correta quanto ao encaminhamento deste caso ?</w:t>
+      </w:r>
+    </w:p>
+    <w:p>
+      <w:pPr>
+        <w:pStyle w:val="normal11"/>
+        <w:spacing w:lineRule="auto" w:line="240"/>
+        <w:jc w:val="both"/>
+        <w:rPr>
+          <w:u w:val="none"/>
+        </w:rPr>
+      </w:pPr>
+      <w:r>
+        <w:rPr>
+          <w:b w:val="false"/>
+          <w:bCs w:val="false"/>
+          <w:sz w:val="22"/>
+          <w:szCs w:val="22"/>
+          <w:u w:val="none"/>
+        </w:rPr>
+        <w:t xml:space="preserve">A) Requisitar necropsia médico-legal por se tratar de morte violenta.</w:t>
+      </w:r>
+    </w:p>
+    <w:p>
+      <w:pPr>
+        <w:pStyle w:val="normal11"/>
+        <w:spacing w:lineRule="auto" w:line="240"/>
+        <w:jc w:val="both"/>
+        <w:rPr>
+          <w:u w:val="none"/>
+        </w:rPr>
+      </w:pPr>
+      <w:r>
+        <w:rPr>
+          <w:b w:val="false"/>
+          <w:bCs w:val="false"/>
+          <w:sz w:val="22"/>
+          <w:szCs w:val="22"/>
+          <w:u w:val="none"/>
+        </w:rPr>
+        <w:t xml:space="preserve">B) O médico assistente deverá preencher a Declaração de óbito por se saber a causa da morte.</w:t>
+      </w:r>
+    </w:p>
+    <w:p>
+      <w:pPr>
+        <w:pStyle w:val="normal11"/>
+        <w:spacing w:lineRule="auto" w:line="240"/>
+        <w:jc w:val="both"/>
+        <w:rPr>
+          <w:u w:val="none"/>
+        </w:rPr>
+      </w:pPr>
+      <w:r>
+        <w:rPr>
+          <w:b w:val="false"/>
+          <w:bCs w:val="false"/>
+          <w:sz w:val="22"/>
+          <w:szCs w:val="22"/>
+          <w:u w:val="none"/>
+        </w:rPr>
+        <w:t xml:space="preserve">C) Médico encaminhar o corpo para o Serviço de Verificação de Óbito ( SVO ) para complementação do diagnóstico.</w:t>
+      </w:r>
+    </w:p>
+    <w:p>
+      <w:pPr>
+        <w:pStyle w:val="normal11"/>
+        <w:spacing w:lineRule="auto" w:line="240"/>
+        <w:jc w:val="both"/>
+        <w:rPr>
+          <w:u w:val="none"/>
+        </w:rPr>
+      </w:pPr>
+      <w:r>
+        <w:rPr>
+          <w:b w:val="false"/>
+          <w:bCs w:val="false"/>
+          <w:sz w:val="22"/>
+          <w:szCs w:val="22"/>
+          <w:u w:val="none"/>
+        </w:rPr>
+        <w:t xml:space="preserve">D) A família decide em acordo com o médico assistente se o corpo vai para o IML.</w:t>
+      </w:r>
+    </w:p>
+    <w:p>
+      <w:pPr>
+        <w:pStyle w:val="normal11"/>
+        <w:spacing w:lineRule="auto" w:line="240"/>
+        <w:jc w:val="both"/>
+        <w:rPr>
+          <w:u w:val="none"/>
+        </w:rPr>
+      </w:pPr>
+      <w:r>
+        <w:rPr>
+          <w:b w:val="false"/>
+          <w:bCs w:val="false"/>
+          <w:sz w:val="22"/>
+          <w:szCs w:val="22"/>
+          <w:u w:val="none"/>
+        </w:rPr>
+        <w:t xml:space="preserve">E) O IML dispensa a necropsia por ter diagnóstico definido pelo médico assistente.</w:t>
       </w:r>
     </w:p>
     <w:p>
@@ -16972,107 +16972,107 @@
           <w:szCs w:val="22"/>
           <w:u w:val="none"/>
         </w:rPr>
-        <w:t xml:space="preserve">82. [A questão não possui enunciado]</w:t>
-      </w:r>
-    </w:p>
-    <w:p>
-      <w:pPr>
-        <w:pStyle w:val="normal11"/>
-        <w:spacing w:lineRule="auto" w:line="240"/>
-        <w:jc w:val="both"/>
-        <w:rPr>
-          <w:u w:val="none"/>
-        </w:rPr>
-      </w:pPr>
-      <w:r>
-        <w:rPr>
-          <w:b w:val="false"/>
-          <w:bCs w:val="false"/>
-          <w:sz w:val="22"/>
-          <w:szCs w:val="22"/>
-          <w:u w:val="none"/>
-        </w:rPr>
-        <w:t xml:space="preserve">A) [Opção indisponível]</w:t>
-      </w:r>
-    </w:p>
-    <w:p>
-      <w:pPr>
-        <w:pStyle w:val="normal11"/>
-        <w:spacing w:lineRule="auto" w:line="240"/>
-        <w:jc w:val="both"/>
-        <w:rPr>
-          <w:u w:val="none"/>
-        </w:rPr>
-      </w:pPr>
-      <w:r>
-        <w:rPr>
-          <w:b w:val="false"/>
-          <w:bCs w:val="false"/>
-          <w:sz w:val="22"/>
-          <w:szCs w:val="22"/>
-          <w:u w:val="none"/>
-        </w:rPr>
-        <w:t xml:space="preserve">B) [Opção indisponível]</w:t>
-      </w:r>
-    </w:p>
-    <w:p>
-      <w:pPr>
-        <w:pStyle w:val="normal11"/>
-        <w:spacing w:lineRule="auto" w:line="240"/>
-        <w:jc w:val="both"/>
-        <w:rPr>
-          <w:u w:val="none"/>
-        </w:rPr>
-      </w:pPr>
-      <w:r>
-        <w:rPr>
-          <w:b w:val="false"/>
-          <w:bCs w:val="false"/>
-          <w:sz w:val="22"/>
-          <w:szCs w:val="22"/>
-          <w:u w:val="none"/>
-        </w:rPr>
-        <w:t xml:space="preserve">C) [Opção indisponível]</w:t>
-      </w:r>
-    </w:p>
-    <w:p>
-      <w:pPr>
-        <w:pStyle w:val="normal11"/>
-        <w:spacing w:lineRule="auto" w:line="240"/>
-        <w:jc w:val="both"/>
-        <w:rPr>
-          <w:u w:val="none"/>
-        </w:rPr>
-      </w:pPr>
-      <w:r>
-        <w:rPr>
-          <w:b w:val="false"/>
-          <w:bCs w:val="false"/>
-          <w:sz w:val="22"/>
-          <w:szCs w:val="22"/>
-          <w:u w:val="none"/>
-        </w:rPr>
-        <w:t xml:space="preserve">D) [Opção indisponível]</w:t>
-      </w:r>
-    </w:p>
-    <w:p>
-      <w:pPr>
-        <w:pStyle w:val="normal11"/>
-        <w:spacing w:lineRule="auto" w:line="240"/>
-        <w:jc w:val="both"/>
-        <w:rPr>
-          <w:u w:val="none"/>
-        </w:rPr>
-      </w:pPr>
-      <w:r>
-        <w:rPr>
-          <w:b w:val="false"/>
-          <w:bCs w:val="false"/>
-          <w:sz w:val="22"/>
-          <w:szCs w:val="22"/>
-          <w:u w:val="none"/>
-        </w:rPr>
-        <w:t xml:space="preserve">E) [Opção indisponível]</w:t>
+        <w:t xml:space="preserve">82. Numa necropsia foram encontradas no pescoço da vítima escoriações irregulares na face lateral direita e um sulco transversal na face anterior e sinais gerais de asfixia. Quais os prováveis mecanismos da morte ?</w:t>
+      </w:r>
+    </w:p>
+    <w:p>
+      <w:pPr>
+        <w:pStyle w:val="normal11"/>
+        <w:spacing w:lineRule="auto" w:line="240"/>
+        <w:jc w:val="both"/>
+        <w:rPr>
+          <w:u w:val="none"/>
+        </w:rPr>
+      </w:pPr>
+      <w:r>
+        <w:rPr>
+          <w:b w:val="false"/>
+          <w:bCs w:val="false"/>
+          <w:sz w:val="22"/>
+          <w:szCs w:val="22"/>
+          <w:u w:val="none"/>
+        </w:rPr>
+        <w:t xml:space="preserve">A) Asfixia por esganadura e sufocação direta.</w:t>
+      </w:r>
+    </w:p>
+    <w:p>
+      <w:pPr>
+        <w:pStyle w:val="normal11"/>
+        <w:spacing w:lineRule="auto" w:line="240"/>
+        <w:jc w:val="both"/>
+        <w:rPr>
+          <w:u w:val="none"/>
+        </w:rPr>
+      </w:pPr>
+      <w:r>
+        <w:rPr>
+          <w:b w:val="false"/>
+          <w:bCs w:val="false"/>
+          <w:sz w:val="22"/>
+          <w:szCs w:val="22"/>
+          <w:u w:val="none"/>
+        </w:rPr>
+        <w:t xml:space="preserve">B) Esganadura e simulação de enforcamento.</w:t>
+      </w:r>
+    </w:p>
+    <w:p>
+      <w:pPr>
+        <w:pStyle w:val="normal11"/>
+        <w:spacing w:lineRule="auto" w:line="240"/>
+        <w:jc w:val="both"/>
+        <w:rPr>
+          <w:u w:val="none"/>
+        </w:rPr>
+      </w:pPr>
+      <w:r>
+        <w:rPr>
+          <w:b w:val="false"/>
+          <w:bCs w:val="false"/>
+          <w:sz w:val="22"/>
+          <w:szCs w:val="22"/>
+          <w:u w:val="none"/>
+        </w:rPr>
+        <w:t xml:space="preserve">C) Estrangulamento associado com esganadura.</w:t>
+      </w:r>
+    </w:p>
+    <w:p>
+      <w:pPr>
+        <w:pStyle w:val="normal11"/>
+        <w:spacing w:lineRule="auto" w:line="240"/>
+        <w:jc w:val="both"/>
+        <w:rPr>
+          <w:u w:val="none"/>
+        </w:rPr>
+      </w:pPr>
+      <w:r>
+        <w:rPr>
+          <w:b w:val="false"/>
+          <w:bCs w:val="false"/>
+          <w:sz w:val="22"/>
+          <w:szCs w:val="22"/>
+          <w:u w:val="none"/>
+        </w:rPr>
+        <w:t xml:space="preserve">D) Enforcamento incompleto e sufocação indireta.</w:t>
+      </w:r>
+    </w:p>
+    <w:p>
+      <w:pPr>
+        <w:pStyle w:val="normal11"/>
+        <w:spacing w:lineRule="auto" w:line="240"/>
+        <w:jc w:val="both"/>
+        <w:rPr>
+          <w:u w:val="none"/>
+        </w:rPr>
+      </w:pPr>
+      <w:r>
+        <w:rPr>
+          <w:b w:val="false"/>
+          <w:bCs w:val="false"/>
+          <w:sz w:val="22"/>
+          <w:szCs w:val="22"/>
+          <w:u w:val="none"/>
+        </w:rPr>
+        <w:t xml:space="preserve">E) Esganadura e compressão torácica.</w:t>
       </w:r>
     </w:p>
     <w:p>
@@ -19628,107 +19628,107 @@
           <w:szCs w:val="22"/>
           <w:u w:val="none"/>
         </w:rPr>
-        <w:t xml:space="preserve">99. [A questão não possui enunciado]</w:t>
-      </w:r>
-    </w:p>
-    <w:p>
-      <w:pPr>
-        <w:pStyle w:val="normal11"/>
-        <w:spacing w:lineRule="auto" w:line="240"/>
-        <w:jc w:val="both"/>
-        <w:rPr>
-          <w:u w:val="none"/>
-        </w:rPr>
-      </w:pPr>
-      <w:r>
-        <w:rPr>
-          <w:b w:val="false"/>
-          <w:bCs w:val="false"/>
-          <w:sz w:val="22"/>
-          <w:szCs w:val="22"/>
-          <w:u w:val="none"/>
-        </w:rPr>
-        <w:t xml:space="preserve">A) [Opção indisponível]</w:t>
-      </w:r>
-    </w:p>
-    <w:p>
-      <w:pPr>
-        <w:pStyle w:val="normal11"/>
-        <w:spacing w:lineRule="auto" w:line="240"/>
-        <w:jc w:val="both"/>
-        <w:rPr>
-          <w:u w:val="none"/>
-        </w:rPr>
-      </w:pPr>
-      <w:r>
-        <w:rPr>
-          <w:b w:val="false"/>
-          <w:bCs w:val="false"/>
-          <w:sz w:val="22"/>
-          <w:szCs w:val="22"/>
-          <w:u w:val="none"/>
-        </w:rPr>
-        <w:t xml:space="preserve">B) [Opção indisponível]</w:t>
-      </w:r>
-    </w:p>
-    <w:p>
-      <w:pPr>
-        <w:pStyle w:val="normal11"/>
-        <w:spacing w:lineRule="auto" w:line="240"/>
-        <w:jc w:val="both"/>
-        <w:rPr>
-          <w:u w:val="none"/>
-        </w:rPr>
-      </w:pPr>
-      <w:r>
-        <w:rPr>
-          <w:b w:val="false"/>
-          <w:bCs w:val="false"/>
-          <w:sz w:val="22"/>
-          <w:szCs w:val="22"/>
-          <w:u w:val="none"/>
-        </w:rPr>
-        <w:t xml:space="preserve">C) [Opção indisponível]</w:t>
-      </w:r>
-    </w:p>
-    <w:p>
-      <w:pPr>
-        <w:pStyle w:val="normal11"/>
-        <w:spacing w:lineRule="auto" w:line="240"/>
-        <w:jc w:val="both"/>
-        <w:rPr>
-          <w:u w:val="none"/>
-        </w:rPr>
-      </w:pPr>
-      <w:r>
-        <w:rPr>
-          <w:b w:val="false"/>
-          <w:bCs w:val="false"/>
-          <w:sz w:val="22"/>
-          <w:szCs w:val="22"/>
-          <w:u w:val="none"/>
-        </w:rPr>
-        <w:t xml:space="preserve">D) [Opção indisponível]</w:t>
-      </w:r>
-    </w:p>
-    <w:p>
-      <w:pPr>
-        <w:pStyle w:val="normal11"/>
-        <w:spacing w:lineRule="auto" w:line="240"/>
-        <w:jc w:val="both"/>
-        <w:rPr>
-          <w:u w:val="none"/>
-        </w:rPr>
-      </w:pPr>
-      <w:r>
-        <w:rPr>
-          <w:b w:val="false"/>
-          <w:bCs w:val="false"/>
-          <w:sz w:val="22"/>
-          <w:szCs w:val="22"/>
-          <w:u w:val="none"/>
-        </w:rPr>
-        <w:t xml:space="preserve">E) [Opção indisponível]</w:t>
+        <w:t xml:space="preserve">99. Segundo o conteúdo apresentado, a responsabilidade subjetiva caracteriza-se pela necessidade de:</w:t>
+      </w:r>
+    </w:p>
+    <w:p>
+      <w:pPr>
+        <w:pStyle w:val="normal11"/>
+        <w:spacing w:lineRule="auto" w:line="240"/>
+        <w:jc w:val="both"/>
+        <w:rPr>
+          <w:u w:val="none"/>
+        </w:rPr>
+      </w:pPr>
+      <w:r>
+        <w:rPr>
+          <w:b w:val="false"/>
+          <w:bCs w:val="false"/>
+          <w:sz w:val="22"/>
+          <w:szCs w:val="22"/>
+          <w:u w:val="none"/>
+        </w:rPr>
+        <w:t xml:space="preserve">A) Existência de dano material exclusivamente.</w:t>
+      </w:r>
+    </w:p>
+    <w:p>
+      <w:pPr>
+        <w:pStyle w:val="normal11"/>
+        <w:spacing w:lineRule="auto" w:line="240"/>
+        <w:jc w:val="both"/>
+        <w:rPr>
+          <w:u w:val="none"/>
+        </w:rPr>
+      </w:pPr>
+      <w:r>
+        <w:rPr>
+          <w:b w:val="false"/>
+          <w:bCs w:val="false"/>
+          <w:sz w:val="22"/>
+          <w:szCs w:val="22"/>
+          <w:u w:val="none"/>
+        </w:rPr>
+        <w:t xml:space="preserve">B) Comprovação de dolo ou culpa do agente.</w:t>
+      </w:r>
+    </w:p>
+    <w:p>
+      <w:pPr>
+        <w:pStyle w:val="normal11"/>
+        <w:spacing w:lineRule="auto" w:line="240"/>
+        <w:jc w:val="both"/>
+        <w:rPr>
+          <w:u w:val="none"/>
+        </w:rPr>
+      </w:pPr>
+      <w:r>
+        <w:rPr>
+          <w:b w:val="false"/>
+          <w:bCs w:val="false"/>
+          <w:sz w:val="22"/>
+          <w:szCs w:val="22"/>
+          <w:u w:val="none"/>
+        </w:rPr>
+        <w:t xml:space="preserve">C) Existência de decisão judicial anterior.</w:t>
+      </w:r>
+    </w:p>
+    <w:p>
+      <w:pPr>
+        <w:pStyle w:val="normal11"/>
+        <w:spacing w:lineRule="auto" w:line="240"/>
+        <w:jc w:val="both"/>
+        <w:rPr>
+          <w:u w:val="none"/>
+        </w:rPr>
+      </w:pPr>
+      <w:r>
+        <w:rPr>
+          <w:b w:val="false"/>
+          <w:bCs w:val="false"/>
+          <w:sz w:val="22"/>
+          <w:szCs w:val="22"/>
+          <w:u w:val="none"/>
+        </w:rPr>
+        <w:t xml:space="preserve">D) Comprovação apenas do dano, independentemente da conduta.</w:t>
+      </w:r>
+    </w:p>
+    <w:p>
+      <w:pPr>
+        <w:pStyle w:val="normal11"/>
+        <w:spacing w:lineRule="auto" w:line="240"/>
+        <w:jc w:val="both"/>
+        <w:rPr>
+          <w:u w:val="none"/>
+        </w:rPr>
+      </w:pPr>
+      <w:r>
+        <w:rPr>
+          <w:b w:val="false"/>
+          <w:bCs w:val="false"/>
+          <w:sz w:val="22"/>
+          <w:szCs w:val="22"/>
+          <w:u w:val="none"/>
+        </w:rPr>
+        <w:t xml:space="preserve">E) Prática de crime pelo agente público.</w:t>
       </w:r>
     </w:p>
     <w:p>
@@ -19769,107 +19769,107 @@
           <w:szCs w:val="22"/>
           <w:u w:val="none"/>
         </w:rPr>
-        <w:t xml:space="preserve">100. [A questão não possui enunciado]</w:t>
-      </w:r>
-    </w:p>
-    <w:p>
-      <w:pPr>
-        <w:pStyle w:val="normal11"/>
-        <w:spacing w:lineRule="auto" w:line="240"/>
-        <w:jc w:val="both"/>
-        <w:rPr>
-          <w:u w:val="none"/>
-        </w:rPr>
-      </w:pPr>
-      <w:r>
-        <w:rPr>
-          <w:b w:val="false"/>
-          <w:bCs w:val="false"/>
-          <w:sz w:val="22"/>
-          <w:szCs w:val="22"/>
-          <w:u w:val="none"/>
-        </w:rPr>
-        <w:t xml:space="preserve">A) [Opção indisponível]</w:t>
-      </w:r>
-    </w:p>
-    <w:p>
-      <w:pPr>
-        <w:pStyle w:val="normal11"/>
-        <w:spacing w:lineRule="auto" w:line="240"/>
-        <w:jc w:val="both"/>
-        <w:rPr>
-          <w:u w:val="none"/>
-        </w:rPr>
-      </w:pPr>
-      <w:r>
-        <w:rPr>
-          <w:b w:val="false"/>
-          <w:bCs w:val="false"/>
-          <w:sz w:val="22"/>
-          <w:szCs w:val="22"/>
-          <w:u w:val="none"/>
-        </w:rPr>
-        <w:t xml:space="preserve">B) [Opção indisponível]</w:t>
-      </w:r>
-    </w:p>
-    <w:p>
-      <w:pPr>
-        <w:pStyle w:val="normal11"/>
-        <w:spacing w:lineRule="auto" w:line="240"/>
-        <w:jc w:val="both"/>
-        <w:rPr>
-          <w:u w:val="none"/>
-        </w:rPr>
-      </w:pPr>
-      <w:r>
-        <w:rPr>
-          <w:b w:val="false"/>
-          <w:bCs w:val="false"/>
-          <w:sz w:val="22"/>
-          <w:szCs w:val="22"/>
-          <w:u w:val="none"/>
-        </w:rPr>
-        <w:t xml:space="preserve">C) [Opção indisponível]</w:t>
-      </w:r>
-    </w:p>
-    <w:p>
-      <w:pPr>
-        <w:pStyle w:val="normal11"/>
-        <w:spacing w:lineRule="auto" w:line="240"/>
-        <w:jc w:val="both"/>
-        <w:rPr>
-          <w:u w:val="none"/>
-        </w:rPr>
-      </w:pPr>
-      <w:r>
-        <w:rPr>
-          <w:b w:val="false"/>
-          <w:bCs w:val="false"/>
-          <w:sz w:val="22"/>
-          <w:szCs w:val="22"/>
-          <w:u w:val="none"/>
-        </w:rPr>
-        <w:t xml:space="preserve">D) [Opção indisponível]</w:t>
-      </w:r>
-    </w:p>
-    <w:p>
-      <w:pPr>
-        <w:pStyle w:val="normal11"/>
-        <w:spacing w:lineRule="auto" w:line="240"/>
-        <w:jc w:val="both"/>
-        <w:rPr>
-          <w:u w:val="none"/>
-        </w:rPr>
-      </w:pPr>
-      <w:r>
-        <w:rPr>
-          <w:b w:val="false"/>
-          <w:bCs w:val="false"/>
-          <w:sz w:val="22"/>
-          <w:szCs w:val="22"/>
-          <w:u w:val="none"/>
-        </w:rPr>
-        <w:t xml:space="preserve">E) [Opção indisponível]</w:t>
+        <w:t xml:space="preserve">100. Nos termos do art. 37, § 6º, da Constituição Federal, o direito de regresso contra o agente responsável pelo dano ocorre nos casos de:</w:t>
+      </w:r>
+    </w:p>
+    <w:p>
+      <w:pPr>
+        <w:pStyle w:val="normal11"/>
+        <w:spacing w:lineRule="auto" w:line="240"/>
+        <w:jc w:val="both"/>
+        <w:rPr>
+          <w:u w:val="none"/>
+        </w:rPr>
+      </w:pPr>
+      <w:r>
+        <w:rPr>
+          <w:b w:val="false"/>
+          <w:bCs w:val="false"/>
+          <w:sz w:val="22"/>
+          <w:szCs w:val="22"/>
+          <w:u w:val="none"/>
+        </w:rPr>
+        <w:t xml:space="preserve">A) Dolo ou culpa.</w:t>
+      </w:r>
+    </w:p>
+    <w:p>
+      <w:pPr>
+        <w:pStyle w:val="normal11"/>
+        <w:spacing w:lineRule="auto" w:line="240"/>
+        <w:jc w:val="both"/>
+        <w:rPr>
+          <w:u w:val="none"/>
+        </w:rPr>
+      </w:pPr>
+      <w:r>
+        <w:rPr>
+          <w:b w:val="false"/>
+          <w:bCs w:val="false"/>
+          <w:sz w:val="22"/>
+          <w:szCs w:val="22"/>
+          <w:u w:val="none"/>
+        </w:rPr>
+        <w:t xml:space="preserve">B) Dolo exclusivamente.</w:t>
+      </w:r>
+    </w:p>
+    <w:p>
+      <w:pPr>
+        <w:pStyle w:val="normal11"/>
+        <w:spacing w:lineRule="auto" w:line="240"/>
+        <w:jc w:val="both"/>
+        <w:rPr>
+          <w:u w:val="none"/>
+        </w:rPr>
+      </w:pPr>
+      <w:r>
+        <w:rPr>
+          <w:b w:val="false"/>
+          <w:bCs w:val="false"/>
+          <w:sz w:val="22"/>
+          <w:szCs w:val="22"/>
+          <w:u w:val="none"/>
+        </w:rPr>
+        <w:t xml:space="preserve">C) Culpa grave exclusivamente.</w:t>
+      </w:r>
+    </w:p>
+    <w:p>
+      <w:pPr>
+        <w:pStyle w:val="normal11"/>
+        <w:spacing w:lineRule="auto" w:line="240"/>
+        <w:jc w:val="both"/>
+        <w:rPr>
+          <w:u w:val="none"/>
+        </w:rPr>
+      </w:pPr>
+      <w:r>
+        <w:rPr>
+          <w:b w:val="false"/>
+          <w:bCs w:val="false"/>
+          <w:sz w:val="22"/>
+          <w:szCs w:val="22"/>
+          <w:u w:val="none"/>
+        </w:rPr>
+        <w:t xml:space="preserve">D) Responsabilidade objetiva do agente.</w:t>
+      </w:r>
+    </w:p>
+    <w:p>
+      <w:pPr>
+        <w:pStyle w:val="normal11"/>
+        <w:spacing w:lineRule="auto" w:line="240"/>
+        <w:jc w:val="both"/>
+        <w:rPr>
+          <w:u w:val="none"/>
+        </w:rPr>
+      </w:pPr>
+      <w:r>
+        <w:rPr>
+          <w:b w:val="false"/>
+          <w:bCs w:val="false"/>
+          <w:sz w:val="22"/>
+          <w:szCs w:val="22"/>
+          <w:u w:val="none"/>
+        </w:rPr>
+        <w:t xml:space="preserve">E) Qualquer dano causado por terceiro.</w:t>
       </w:r>
     </w:p>
     <w:p>

</xml_diff>